<commit_message>
E3 y E4: fichas de los agentes del proyecto y las dos IA en Herramientas
- IA — Agentes del proyecto: Claude Code, subagentes y MCP de Figma (rol,
  modelos, herramientas, contexto, límites y ejemplos reales); pasa a en-revision.
- Herramientas del proyecto: tabla que separa la IA para desarrollar de la IA
  del producto (DEC-0012); DOCX de Relevamiento regenerado.

Co-Authored-By: Claude Opus 5.5 <noreply@anthropic.com>
</commit_message>
<xml_diff>
--- a/07-Entregables/Relevamiento/Rumbo — Relevamiento.docx
+++ b/07-Entregables/Relevamiento/Rumbo — Relevamiento.docx
@@ -278,7 +278,7 @@
     </w:p>
     <w:bookmarkEnd w:id="54"/>
     <w:bookmarkEnd w:id="55"/>
-    <w:bookmarkStart w:id="60" w:name="herramientas-del-proyecto"/>
+    <w:bookmarkStart w:id="61" w:name="herramientas-del-proyecto"/>
     <w:p>
       <w:pPr>
         <w:pStyle w:val="Heading1"/>
@@ -327,7 +327,7 @@
         <w:t xml:space="preserve">con la que se construyen los diagramas.</w:t>
       </w:r>
     </w:p>
-    <w:bookmarkStart w:id="58" w:name="agente-de-ia-claude"/>
+    <w:bookmarkStart w:id="59" w:name="agente-de-ia-claude"/>
     <w:p>
       <w:pPr>
         <w:pStyle w:val="Heading2"/>
@@ -902,8 +902,356 @@
       </w:r>
     </w:p>
     <w:bookmarkEnd w:id="57"/>
+    <w:bookmarkStart w:id="58" w:name="X7e2dd9a6045d325b4801de4b73883c31fd68a45"/>
+    <w:p>
+      <w:pPr>
+        <w:pStyle w:val="Heading3"/>
+      </w:pPr>
+      <w:r>
+        <w:t xml:space="preserve">Dos usos de la IA: para desarrollar y dentro del producto</w:t>
+      </w:r>
+    </w:p>
+    <w:p>
+      <w:pPr>
+        <w:pStyle w:val="FirstParagraph"/>
+      </w:pPr>
+      <w:r>
+        <w:t xml:space="preserve">En Rumbo la IA aparece en dos lugares distintos, con decisiones y justificaciones separadas:</w:t>
+      </w:r>
+    </w:p>
+    <w:tbl>
+      <w:tblPr>
+        <w:tblStyle w:val="Table"/>
+        <w:tblW w:type="pct" w:w="5000"/>
+        <w:tblLayout w:type="fixed"/>
+        <w:tblLook w:firstRow="1" w:lastRow="0" w:firstColumn="0" w:lastColumn="0" w:noHBand="0" w:noVBand="0" w:val="0020"/>
+      </w:tblPr>
+      <w:tblGrid>
+        <w:gridCol w:w="2640"/>
+        <w:gridCol w:w="2640"/>
+        <w:gridCol w:w="2640"/>
+      </w:tblGrid>
+      <w:tr>
+        <w:trPr>
+          <w:tblHeader w:val="on"/>
+        </w:trPr>
+        <w:tc>
+          <w:tcPr/>
+          <w:p>
+            <w:pPr>
+              <w:pStyle w:val="Compact"/>
+            </w:pPr>
+          </w:p>
+        </w:tc>
+        <w:tc>
+          <w:tcPr/>
+          <w:p>
+            <w:pPr>
+              <w:pStyle w:val="Compact"/>
+            </w:pPr>
+            <w:r>
+              <w:t xml:space="preserve">IA para desarrollar</w:t>
+            </w:r>
+          </w:p>
+        </w:tc>
+        <w:tc>
+          <w:tcPr/>
+          <w:p>
+            <w:pPr>
+              <w:pStyle w:val="Compact"/>
+            </w:pPr>
+            <w:r>
+              <w:t xml:space="preserve">IA dentro del producto</w:t>
+            </w:r>
+          </w:p>
+        </w:tc>
+      </w:tr>
+      <w:tr>
+        <w:tc>
+          <w:tcPr/>
+          <w:p>
+            <w:pPr>
+              <w:pStyle w:val="Compact"/>
+            </w:pPr>
+            <w:r>
+              <w:rPr>
+                <w:b/>
+                <w:bCs/>
+              </w:rPr>
+              <w:t xml:space="preserve">Qué es</w:t>
+            </w:r>
+          </w:p>
+        </w:tc>
+        <w:tc>
+          <w:tcPr/>
+          <w:p>
+            <w:pPr>
+              <w:pStyle w:val="Compact"/>
+            </w:pPr>
+            <w:r>
+              <w:t xml:space="preserve">El agente con el que el equipo analiza, diseña y programa Rumbo</w:t>
+            </w:r>
+          </w:p>
+        </w:tc>
+        <w:tc>
+          <w:tcPr/>
+          <w:p>
+            <w:pPr>
+              <w:pStyle w:val="Compact"/>
+            </w:pPr>
+            <w:r>
+              <w:t xml:space="preserve">Una función que usan los empleados de la agencia</w:t>
+            </w:r>
+          </w:p>
+        </w:tc>
+      </w:tr>
+      <w:tr>
+        <w:tc>
+          <w:tcPr/>
+          <w:p>
+            <w:pPr>
+              <w:pStyle w:val="Compact"/>
+            </w:pPr>
+            <w:r>
+              <w:rPr>
+                <w:b/>
+                <w:bCs/>
+              </w:rPr>
+              <w:t xml:space="preserve">Quién la usa</w:t>
+            </w:r>
+          </w:p>
+        </w:tc>
+        <w:tc>
+          <w:tcPr/>
+          <w:p>
+            <w:pPr>
+              <w:pStyle w:val="Compact"/>
+            </w:pPr>
+            <w:r>
+              <w:t xml:space="preserve">Los tres integrantes del equipo</w:t>
+            </w:r>
+          </w:p>
+        </w:tc>
+        <w:tc>
+          <w:tcPr/>
+          <w:p>
+            <w:pPr>
+              <w:pStyle w:val="Compact"/>
+            </w:pPr>
+            <w:r>
+              <w:t xml:space="preserve">El empleado con acceso al módulo de redes</w:t>
+            </w:r>
+          </w:p>
+        </w:tc>
+      </w:tr>
+      <w:tr>
+        <w:tc>
+          <w:tcPr/>
+          <w:p>
+            <w:pPr>
+              <w:pStyle w:val="Compact"/>
+            </w:pPr>
+            <w:r>
+              <w:rPr>
+                <w:b/>
+                <w:bCs/>
+              </w:rPr>
+              <w:t xml:space="preserve">Herramienta y modelo</w:t>
+            </w:r>
+          </w:p>
+        </w:tc>
+        <w:tc>
+          <w:tcPr/>
+          <w:p>
+            <w:pPr>
+              <w:pStyle w:val="Compact"/>
+            </w:pPr>
+            <w:r>
+              <w:t xml:space="preserve">Claude Code, con Claude Opus o Sonnet según la tarea</w:t>
+            </w:r>
+          </w:p>
+        </w:tc>
+        <w:tc>
+          <w:tcPr/>
+          <w:p>
+            <w:pPr>
+              <w:pStyle w:val="Compact"/>
+            </w:pPr>
+            <w:r>
+              <w:t xml:space="preserve">Claude Sonnet 5.5, llamado desde el backend con LangChain</w:t>
+            </w:r>
+          </w:p>
+        </w:tc>
+      </w:tr>
+      <w:tr>
+        <w:tc>
+          <w:tcPr/>
+          <w:p>
+            <w:pPr>
+              <w:pStyle w:val="Compact"/>
+            </w:pPr>
+            <w:r>
+              <w:rPr>
+                <w:b/>
+                <w:bCs/>
+              </w:rPr>
+              <w:t xml:space="preserve">Para qué</w:t>
+            </w:r>
+          </w:p>
+        </w:tc>
+        <w:tc>
+          <w:tcPr/>
+          <w:p>
+            <w:pPr>
+              <w:pStyle w:val="Compact"/>
+            </w:pPr>
+            <w:r>
+              <w:t xml:space="preserve">Especificar casos de uso, modelar el dominio, dibujar diagramas, generar entregables y escribir código</w:t>
+            </w:r>
+          </w:p>
+        </w:tc>
+        <w:tc>
+          <w:tcPr/>
+          <w:p>
+            <w:pPr>
+              <w:pStyle w:val="Compact"/>
+            </w:pPr>
+            <w:r>
+              <w:t xml:space="preserve">Generar un borrador de posteo a partir del tema, el canal y el tono (CU-20)</w:t>
+            </w:r>
+          </w:p>
+        </w:tc>
+      </w:tr>
+      <w:tr>
+        <w:tc>
+          <w:tcPr/>
+          <w:p>
+            <w:pPr>
+              <w:pStyle w:val="Compact"/>
+            </w:pPr>
+            <w:r>
+              <w:rPr>
+                <w:b/>
+                <w:bCs/>
+              </w:rPr>
+              <w:t xml:space="preserve">Qué datos ve</w:t>
+            </w:r>
+          </w:p>
+        </w:tc>
+        <w:tc>
+          <w:tcPr/>
+          <w:p>
+            <w:pPr>
+              <w:pStyle w:val="Compact"/>
+            </w:pPr>
+            <w:r>
+              <w:t xml:space="preserve">El vault y el código del proyecto</w:t>
+            </w:r>
+          </w:p>
+        </w:tc>
+        <w:tc>
+          <w:tcPr/>
+          <w:p>
+            <w:pPr>
+              <w:pStyle w:val="Compact"/>
+            </w:pPr>
+            <w:r>
+              <w:t xml:space="preserve">Solo el tema, el canal y el tono: ningún dato de clientes</w:t>
+            </w:r>
+          </w:p>
+        </w:tc>
+      </w:tr>
+      <w:tr>
+        <w:tc>
+          <w:tcPr/>
+          <w:p>
+            <w:pPr>
+              <w:pStyle w:val="Compact"/>
+            </w:pPr>
+            <w:r>
+              <w:rPr>
+                <w:b/>
+                <w:bCs/>
+              </w:rPr>
+              <w:t xml:space="preserve">Costo</w:t>
+            </w:r>
+          </w:p>
+        </w:tc>
+        <w:tc>
+          <w:tcPr/>
+          <w:p>
+            <w:pPr>
+              <w:pStyle w:val="Compact"/>
+            </w:pPr>
+            <w:r>
+              <w:t xml:space="preserve">Incluido en la suscripción paga de cada integrante</w:t>
+            </w:r>
+          </w:p>
+        </w:tc>
+        <w:tc>
+          <w:tcPr/>
+          <w:p>
+            <w:pPr>
+              <w:pStyle w:val="Compact"/>
+            </w:pPr>
+            <w:r>
+              <w:t xml:space="preserve">Por uso de la API; con unas decenas de borradores por mes, centavos de dólar</w:t>
+            </w:r>
+          </w:p>
+        </w:tc>
+      </w:tr>
+    </w:tbl>
+    <w:p>
+      <w:pPr>
+        <w:pStyle w:val="BodyText"/>
+      </w:pPr>
+      <w:r>
+        <w:t xml:space="preserve">La IA</w:t>
+      </w:r>
+      <w:r>
+        <w:t xml:space="preserve"> </w:t>
+      </w:r>
+      <w:r>
+        <w:rPr>
+          <w:b/>
+          <w:bCs/>
+        </w:rPr>
+        <w:t xml:space="preserve">para desarrollar</w:t>
+      </w:r>
+      <w:r>
+        <w:t xml:space="preserve"> </w:t>
+      </w:r>
+      <w:r>
+        <w:t xml:space="preserve">se eligió por las razones de arriba: experiencia del equipo, suscripción disponible y desempeño en código. La IA</w:t>
+      </w:r>
+      <w:r>
+        <w:t xml:space="preserve"> </w:t>
+      </w:r>
+      <w:r>
+        <w:rPr>
+          <w:b/>
+          <w:bCs/>
+        </w:rPr>
+        <w:t xml:space="preserve">del producto</w:t>
+      </w:r>
+      <w:r>
+        <w:t xml:space="preserve"> </w:t>
+      </w:r>
+      <w:r>
+        <w:t xml:space="preserve">se eligió con otro criterio: como la agencia solo percibe la calidad del texto en español y el volumen es bajo, se prefirió Sonnet 5.5 frente a Haiku 4.5, aunque cueste el doble. En los dos casos una persona revisa el resultado: el equipo revisa lo que produce el agente y el empleado revisa el borrador antes de publicarlo a mano, porque la publicación automática en redes está fuera del alcance (Alcance y fuera de alcance).</w:t>
+      </w:r>
+    </w:p>
+    <w:p>
+      <w:pPr>
+        <w:pStyle w:val="BodyText"/>
+      </w:pPr>
+      <w:r>
+        <w:t xml:space="preserve">Los agentes que usa el equipo, y el enlace a la decisión sobre el modelo del producto, están en IA — Agentes del proyecto.</w:t>
+      </w:r>
+    </w:p>
     <w:bookmarkEnd w:id="58"/>
-    <w:bookmarkStart w:id="59" w:name="herramienta-de-modelado-mermaid"/>
+    <w:bookmarkEnd w:id="59"/>
+    <w:bookmarkStart w:id="60" w:name="herramienta-de-modelado-mermaid"/>
     <w:p>
       <w:pPr>
         <w:pStyle w:val="Heading2"/>
@@ -1021,9 +1369,9 @@
         <w:t xml:space="preserve">se eligió Mermaid por rapidez de iteración e integración con el repositorio; si se necesitara la notación estricta de casos de uso, se complementa con esas herramientas.</w:t>
       </w:r>
     </w:p>
-    <w:bookmarkEnd w:id="59"/>
     <w:bookmarkEnd w:id="60"/>
-    <w:bookmarkStart w:id="61" w:name="objetivos-del-sistema"/>
+    <w:bookmarkEnd w:id="61"/>
+    <w:bookmarkStart w:id="62" w:name="objetivos-del-sistema"/>
     <w:p>
       <w:pPr>
         <w:pStyle w:val="Heading1"/>
@@ -1185,8 +1533,8 @@
         <w:t xml:space="preserve">— dashboard, estadísticas y reportes mensuales → MOD-Dashboard.</w:t>
       </w:r>
     </w:p>
-    <w:bookmarkEnd w:id="61"/>
-    <w:bookmarkStart w:id="66" w:name="alcance-y-fuera-de-alcance"/>
+    <w:bookmarkEnd w:id="62"/>
+    <w:bookmarkStart w:id="67" w:name="alcance-y-fuera-de-alcance"/>
     <w:p>
       <w:pPr>
         <w:pStyle w:val="Heading1"/>
@@ -1195,7 +1543,7 @@
         <w:t xml:space="preserve">Alcance y fuera de alcance</w:t>
       </w:r>
     </w:p>
-    <w:bookmarkStart w:id="62" w:name="módulos-incluidos-web-y-mobile"/>
+    <w:bookmarkStart w:id="63" w:name="módulos-incluidos-web-y-mobile"/>
     <w:p>
       <w:pPr>
         <w:pStyle w:val="Heading2"/>
@@ -1446,8 +1794,8 @@
         <w:t xml:space="preserve">— acceso individual con usuario y contraseña, roles con distinta visibilidad y registro de autoría de los cambios.</w:t>
       </w:r>
     </w:p>
-    <w:bookmarkEnd w:id="62"/>
-    <w:bookmarkStart w:id="63" w:name="fuera-de-alcance-esta-etapa"/>
+    <w:bookmarkEnd w:id="63"/>
+    <w:bookmarkStart w:id="64" w:name="fuera-de-alcance-esta-etapa"/>
     <w:p>
       <w:pPr>
         <w:pStyle w:val="Heading2"/>
@@ -1611,8 +1959,8 @@
         <w:t xml:space="preserve">el sistema genera el aviso internamente y la persona decide cuándo escribirle por el canal que corresponda. La automatización por WhatsApp queda para más adelante y será configurable.</w:t>
       </w:r>
     </w:p>
-    <w:bookmarkEnd w:id="63"/>
-    <w:bookmarkStart w:id="64" w:name="incluido-explícitamente"/>
+    <w:bookmarkEnd w:id="64"/>
+    <w:bookmarkStart w:id="65" w:name="incluido-explícitamente"/>
     <w:p>
       <w:pPr>
         <w:pStyle w:val="Heading2"/>
@@ -1694,8 +2042,8 @@
         <w:t xml:space="preserve">cada Hotel del itinerario puede tener su fecha de vencimiento de pago a proveedor, con Alerta un mes antes (CU-09 Armar itinerario de hoteles).</w:t>
       </w:r>
     </w:p>
-    <w:bookmarkEnd w:id="64"/>
-    <w:bookmarkStart w:id="65" w:name="fase-2-fuera-de-esta-etapa"/>
+    <w:bookmarkEnd w:id="65"/>
+    <w:bookmarkStart w:id="66" w:name="fase-2-fuera-de-esta-etapa"/>
     <w:p>
       <w:pPr>
         <w:pStyle w:val="Heading2"/>
@@ -1770,9 +2118,9 @@
         <w:t xml:space="preserve">publicación directa en redes y conexión con proveedores.</w:t>
       </w:r>
     </w:p>
-    <w:bookmarkEnd w:id="65"/>
     <w:bookmarkEnd w:id="66"/>
-    <w:bookmarkStart w:id="73" w:name="actores"/>
+    <w:bookmarkEnd w:id="67"/>
+    <w:bookmarkStart w:id="74" w:name="actores"/>
     <w:p>
       <w:pPr>
         <w:pStyle w:val="Heading1"/>
@@ -1789,7 +2137,7 @@
         <w:t xml:space="preserve">En una PyME una misma persona puede cubrir varios roles.</w:t>
       </w:r>
     </w:p>
-    <w:bookmarkStart w:id="67" w:name="empleado-asesor-usuario-principal"/>
+    <w:bookmarkStart w:id="68" w:name="empleado-asesor-usuario-principal"/>
     <w:p>
       <w:pPr>
         <w:pStyle w:val="Heading2"/>
@@ -1866,8 +2214,8 @@
         <w:t xml:space="preserve">Casos de uso: CU-01 De la consulta a la venta.</w:t>
       </w:r>
     </w:p>
-    <w:bookmarkEnd w:id="67"/>
-    <w:bookmarkStart w:id="68" w:name="administrador-configuración-y-operación"/>
+    <w:bookmarkEnd w:id="68"/>
+    <w:bookmarkStart w:id="69" w:name="administrador-configuración-y-operación"/>
     <w:p>
       <w:pPr>
         <w:pStyle w:val="Heading2"/>
@@ -1935,8 +2283,8 @@
         <w:t xml:space="preserve">.</w:t>
       </w:r>
     </w:p>
-    <w:bookmarkEnd w:id="68"/>
-    <w:bookmarkStart w:id="69" w:name="dueñoa-visión-del-negocio"/>
+    <w:bookmarkEnd w:id="69"/>
+    <w:bookmarkStart w:id="70" w:name="dueñoa-visión-del-negocio"/>
     <w:p>
       <w:pPr>
         <w:pStyle w:val="Heading2"/>
@@ -1991,8 +2339,8 @@
         <w:t xml:space="preserve">.</w:t>
       </w:r>
     </w:p>
-    <w:bookmarkEnd w:id="69"/>
-    <w:bookmarkStart w:id="70" w:name="X6c0ef285ed268354d46c074c14239c2805ce85b"/>
+    <w:bookmarkEnd w:id="70"/>
+    <w:bookmarkStart w:id="71" w:name="X6c0ef285ed268354d46c074c14239c2805ce85b"/>
     <w:p>
       <w:pPr>
         <w:pStyle w:val="Heading2"/>
@@ -2075,8 +2423,8 @@
         <w:t xml:space="preserve">.</w:t>
       </w:r>
     </w:p>
-    <w:bookmarkEnd w:id="70"/>
-    <w:bookmarkStart w:id="71" w:name="X8f5e30d3a5e8695bc0eada9c82b6705f97940fc"/>
+    <w:bookmarkEnd w:id="71"/>
+    <w:bookmarkStart w:id="72" w:name="X8f5e30d3a5e8695bc0eada9c82b6705f97940fc"/>
     <w:p>
       <w:pPr>
         <w:pStyle w:val="Heading2"/>
@@ -2164,8 +2512,8 @@
         <w:t xml:space="preserve">(o cubren ellos mismos). En una PyME suele concentrarse en una persona.</w:t>
       </w:r>
     </w:p>
-    <w:bookmarkEnd w:id="71"/>
-    <w:bookmarkStart w:id="72" w:name="pasajero-cliente-actor-externo"/>
+    <w:bookmarkEnd w:id="72"/>
+    <w:bookmarkStart w:id="73" w:name="pasajero-cliente-actor-externo"/>
     <w:p>
       <w:pPr>
         <w:pStyle w:val="Heading2"/>
@@ -2208,9 +2556,9 @@
         <w:t xml:space="preserve">Se modela como Cliente (dato), no como Usuario (operador).</w:t>
       </w:r>
     </w:p>
-    <w:bookmarkEnd w:id="72"/>
     <w:bookmarkEnd w:id="73"/>
-    <w:bookmarkStart w:id="80" w:name="circuito-de-la-consulta-a-la-venta"/>
+    <w:bookmarkEnd w:id="74"/>
+    <w:bookmarkStart w:id="81" w:name="circuito-de-la-consulta-a-la-venta"/>
     <w:p>
       <w:pPr>
         <w:pStyle w:val="Heading1"/>
@@ -2261,7 +2609,7 @@
         <w:t xml:space="preserve">llega una consulta por Instagram, WhatsApp o de forma presencial.</w:t>
       </w:r>
     </w:p>
-    <w:bookmarkStart w:id="74" w:name="los-seis-pasos-del-circuito"/>
+    <w:bookmarkStart w:id="75" w:name="los-seis-pasos-del-circuito"/>
     <w:p>
       <w:pPr>
         <w:pStyle w:val="Heading2"/>
@@ -2402,8 +2750,8 @@
         <w:t xml:space="preserve">Al finalizar el viaje, el sistema recuerda pedir la reseña; el cliente la deja y el hotel queda consolidado en el catálogo para futuras recomendaciones.</w:t>
       </w:r>
     </w:p>
-    <w:bookmarkEnd w:id="74"/>
-    <w:bookmarkStart w:id="75" w:name="situaciones-frecuentes"/>
+    <w:bookmarkEnd w:id="75"/>
+    <w:bookmarkStart w:id="76" w:name="situaciones-frecuentes"/>
     <w:p>
       <w:pPr>
         <w:pStyle w:val="Heading2"/>
@@ -2500,8 +2848,8 @@
         <w:t xml:space="preserve">la oportunidad se cierra como perdida registrando el motivo, que después alimenta los reportes.</w:t>
       </w:r>
     </w:p>
-    <w:bookmarkEnd w:id="75"/>
-    <w:bookmarkStart w:id="79" w:name="resultado"/>
+    <w:bookmarkEnd w:id="76"/>
+    <w:bookmarkStart w:id="80" w:name="resultado"/>
     <w:p>
       <w:pPr>
         <w:pStyle w:val="Heading2"/>
@@ -2527,18 +2875,18 @@
           <wp:inline>
             <wp:extent cx="5465445" cy="7194310"/>
             <wp:effectExtent b="0" l="0" r="0" t="0"/>
-            <wp:docPr descr="Figura 1. Diagrama de secuencia del circuito de la consulta a la venta." title="" id="77" name="Picture"/>
+            <wp:docPr descr="Figura 1. Diagrama de secuencia del circuito de la consulta a la venta." title="" id="78" name="Picture"/>
             <a:graphic>
               <a:graphicData uri="http://schemas.openxmlformats.org/drawingml/2006/picture">
                 <pic:pic>
                   <pic:nvPicPr>
-                    <pic:cNvPr descr="DGM-SEC-consulta-a-venta.png" id="78" name="Picture"/>
+                    <pic:cNvPr descr="DGM-SEC-consulta-a-venta.png" id="79" name="Picture"/>
                     <pic:cNvPicPr>
                       <a:picLocks noChangeArrowheads="1" noChangeAspect="1"/>
                     </pic:cNvPicPr>
                   </pic:nvPicPr>
                   <pic:blipFill>
-                    <a:blip r:embed="rId76"/>
+                    <a:blip r:embed="rId77"/>
                     <a:stretch>
                       <a:fillRect/>
                     </a:stretch>
@@ -2573,8 +2921,8 @@
         <w:t xml:space="preserve">Figura 1. Diagrama de secuencia del circuito de la consulta a la venta.</w:t>
       </w:r>
     </w:p>
-    <w:bookmarkEnd w:id="79"/>
     <w:bookmarkEnd w:id="80"/>
+    <w:bookmarkEnd w:id="81"/>
     <w:sectPr>
       <w:footerReference r:id="rId40" w:type="default"/>
       <w:footnotePr>

</xml_diff>

<commit_message>
Entregables: antecedentes en el Relevamiento y nuevo DOCX de Inteligencia artificial
- build-relevamiento.sh suma Antecedentes (H1) como primera sección.
- Nuevo build-ia.sh y 07-Entregables/IA/: modelo de IA del producto (DEC-0012)
  y agentes del proyecto (E3), con la misma plantilla y el mismo filtro.
- La nota de agentes deja las sublistas para que el DOCX no las aplane.

Co-Authored-By: Claude Opus 5.5 <noreply@anthropic.com>
</commit_message>
<xml_diff>
--- a/07-Entregables/Relevamiento/Rumbo — Relevamiento.docx
+++ b/07-Entregables/Relevamiento/Rumbo — Relevamiento.docx
@@ -129,7 +129,7 @@
         <w:t xml:space="preserve">definición del proyecto</w:t>
       </w:r>
       <w:r>
-        <w:t xml:space="preserve">: por qué el sistema vale la pena, qué objetivos persigue, hasta dónde llega su alcance, quiénes lo usan y cómo es el circuito de trabajo que digitaliza.</w:t>
+        <w:t xml:space="preserve">: cómo trabaja hoy la agencia y qué ofrece el mercado, por qué el sistema vale la pena, qué objetivos persigue, hasta dónde llega su alcance, quiénes lo usan y cómo es el circuito de trabajo que digitaliza.</w:t>
       </w:r>
     </w:p>
     <w:p>
@@ -170,13 +170,13 @@
       </w:r>
     </w:p>
     <w:bookmarkEnd w:id="49"/>
-    <w:bookmarkStart w:id="55" w:name="justificación-del-sistema"/>
+    <w:bookmarkStart w:id="64" w:name="antecedentes"/>
     <w:p>
       <w:pPr>
         <w:pStyle w:val="Heading1"/>
       </w:pPr>
       <w:r>
-        <w:t xml:space="preserve">Justificación del sistema</w:t>
+        <w:t xml:space="preserve">Antecedentes</w:t>
       </w:r>
     </w:p>
     <w:p>
@@ -184,16 +184,16 @@
         <w:pStyle w:val="FirstParagraph"/>
       </w:pPr>
       <w:r>
-        <w:t xml:space="preserve">Por qué vale la pena construir Rumbo: el trabajo manual de la agencia genera problemas concretos que un sistema a medida resuelve mejor que Excel o un CRM genérico.</w:t>
-      </w:r>
-    </w:p>
-    <w:bookmarkStart w:id="50" w:name="un-problema-real-y-costoso"/>
+        <w:t xml:space="preserve">Cómo resuelve hoy la agencia la gestión que Rumbo viene a ordenar, y qué ofrecen las herramientas que ya existen en el mercado. Junto con Objetivos del sistema, Justificación del sistema y Alcance y fuera de alcance completa la presentación general del proyecto.</w:t>
+      </w:r>
+    </w:p>
+    <w:bookmarkStart w:id="50" w:name="cómo-trabaja-hoy-la-agencia"/>
     <w:p>
       <w:pPr>
         <w:pStyle w:val="Heading2"/>
       </w:pPr>
       <w:r>
-        <w:t xml:space="preserve">Un problema real y costoso</w:t>
+        <w:t xml:space="preserve">Cómo trabaja hoy la agencia</w:t>
       </w:r>
     </w:p>
     <w:p>
@@ -201,17 +201,202 @@
         <w:pStyle w:val="FirstParagraph"/>
       </w:pPr>
       <w:r>
-        <w:t xml:space="preserve">Gestionar en papel y Excel hace que se pierdan ventas, se olviden cobros y no quede memoria del cliente.</w:t>
+        <w:t xml:space="preserve">La agencia es una PyME de turismo que gestiona clientes, reservas, cobros y redes</w:t>
+      </w:r>
+      <w:r>
+        <w:t xml:space="preserve"> </w:t>
+      </w:r>
+      <w:r>
+        <w:rPr>
+          <w:b/>
+          <w:bCs/>
+        </w:rPr>
+        <w:t xml:space="preserve">a mano</w:t>
+      </w:r>
+      <w:r>
+        <w:t xml:space="preserve">, con información repartida entre papel, planillas de Excel, cuadernos y chats:</w:t>
+      </w:r>
+    </w:p>
+    <w:p>
+      <w:pPr>
+        <w:pStyle w:val="Compact"/>
+        <w:numPr>
+          <w:ilvl w:val="0"/>
+          <w:numId w:val="1001"/>
+        </w:numPr>
+      </w:pPr>
+      <w:r>
+        <w:rPr>
+          <w:b/>
+          <w:bCs/>
+        </w:rPr>
+        <w:t xml:space="preserve">Carpetas físicas por viaje.</w:t>
+      </w:r>
+      <w:r>
+        <w:t xml:space="preserve"> </w:t>
+      </w:r>
+      <w:r>
+        <w:t xml:space="preserve">Cada viaje tiene su carpeta en papel; no hay un lugar único donde ver los clientes y los viajes juntos.</w:t>
+      </w:r>
+    </w:p>
+    <w:p>
+      <w:pPr>
+        <w:pStyle w:val="Compact"/>
+        <w:numPr>
+          <w:ilvl w:val="0"/>
+          <w:numId w:val="1001"/>
+        </w:numPr>
+      </w:pPr>
+      <w:r>
+        <w:rPr>
+          <w:b/>
+          <w:bCs/>
+        </w:rPr>
+        <w:t xml:space="preserve">Consultas por Instagram, WhatsApp o en persona.</w:t>
+      </w:r>
+      <w:r>
+        <w:t xml:space="preserve"> </w:t>
+      </w:r>
+      <w:r>
+        <w:t xml:space="preserve">La consulta llega por un canal y el seguimiento hasta la cotización y el cierre depende de la memoria de quien la atendió (ver Circuito de la consulta a la venta).</w:t>
+      </w:r>
+    </w:p>
+    <w:p>
+      <w:pPr>
+        <w:pStyle w:val="Compact"/>
+        <w:numPr>
+          <w:ilvl w:val="0"/>
+          <w:numId w:val="1001"/>
+        </w:numPr>
+      </w:pPr>
+      <w:r>
+        <w:rPr>
+          <w:b/>
+          <w:bCs/>
+        </w:rPr>
+        <w:t xml:space="preserve">Cobros y vencimientos anotados a mano.</w:t>
+      </w:r>
+      <w:r>
+        <w:t xml:space="preserve"> </w:t>
+      </w:r>
+      <w:r>
+        <w:t xml:space="preserve">Las señas, las cuotas de los pasajeros y los pagos a los operadores se controlan en planillas, sin avisos automáticos.</w:t>
+      </w:r>
+    </w:p>
+    <w:p>
+      <w:pPr>
+        <w:pStyle w:val="Compact"/>
+        <w:numPr>
+          <w:ilvl w:val="0"/>
+          <w:numId w:val="1001"/>
+        </w:numPr>
+      </w:pPr>
+      <w:r>
+        <w:rPr>
+          <w:b/>
+          <w:bCs/>
+        </w:rPr>
+        <w:t xml:space="preserve">Avisos a los pasajeros por WhatsApp.</w:t>
+      </w:r>
+      <w:r>
+        <w:t xml:space="preserve"> </w:t>
+      </w:r>
+      <w:r>
+        <w:t xml:space="preserve">Recordar un pago, un formulario migratorio (por ejemplo, el eTicket de República Dominicana), el seguro o los vouchers es una tarea manual que depende de acordarse.</w:t>
+      </w:r>
+    </w:p>
+    <w:p>
+      <w:pPr>
+        <w:pStyle w:val="Compact"/>
+        <w:numPr>
+          <w:ilvl w:val="0"/>
+          <w:numId w:val="1001"/>
+        </w:numPr>
+      </w:pPr>
+      <w:r>
+        <w:rPr>
+          <w:b/>
+          <w:bCs/>
+        </w:rPr>
+        <w:t xml:space="preserve">Vendedores externos.</w:t>
+      </w:r>
+      <w:r>
+        <w:t xml:space="preserve"> </w:t>
+      </w:r>
+      <w:r>
+        <w:t xml:space="preserve">Además de los empleados, trabajan vendedores freelance, y hay que saber qué vendió cada uno y cuánto corresponde pagarle.</w:t>
+      </w:r>
+    </w:p>
+    <w:p>
+      <w:pPr>
+        <w:pStyle w:val="Compact"/>
+        <w:numPr>
+          <w:ilvl w:val="0"/>
+          <w:numId w:val="1001"/>
+        </w:numPr>
+      </w:pPr>
+      <w:r>
+        <w:rPr>
+          <w:b/>
+          <w:bCs/>
+        </w:rPr>
+        <w:t xml:space="preserve">Operaciones en pesos y en dólares.</w:t>
+      </w:r>
+      <w:r>
+        <w:t xml:space="preserve"> </w:t>
+      </w:r>
+      <w:r>
+        <w:t xml:space="preserve">La ganancia no es un porcentaje fijo: cambia según el viaje, el operador y la negociación.</w:t>
+      </w:r>
+    </w:p>
+    <w:p>
+      <w:pPr>
+        <w:pStyle w:val="Compact"/>
+        <w:numPr>
+          <w:ilvl w:val="0"/>
+          <w:numId w:val="1001"/>
+        </w:numPr>
+      </w:pPr>
+      <w:r>
+        <w:rPr>
+          <w:b/>
+          <w:bCs/>
+        </w:rPr>
+        <w:t xml:space="preserve">Clientes fieles como activo principal.</w:t>
+      </w:r>
+      <w:r>
+        <w:t xml:space="preserve"> </w:t>
+      </w:r>
+      <w:r>
+        <w:t xml:space="preserve">Llegan pocos clientes nuevos, así que el negocio se sostiene volviendo a venderles a los de siempre.</w:t>
+      </w:r>
+    </w:p>
+    <w:p>
+      <w:pPr>
+        <w:pStyle w:val="FirstParagraph"/>
+      </w:pPr>
+      <w:r>
+        <w:rPr>
+          <w:b/>
+          <w:bCs/>
+        </w:rPr>
+        <w:t xml:space="preserve">Consecuencias:</w:t>
+      </w:r>
+      <w:r>
+        <w:t xml:space="preserve"> </w:t>
+      </w:r>
+      <w:r>
+        <w:t xml:space="preserve">se pierden ventas porque una consulta queda sin seguimiento, se olvidan cobros y vencimientos, y no queda memoria del cliente (qué viajes hizo, qué prefiere, cuándo conviene volver a contactarlo).</w:t>
       </w:r>
     </w:p>
     <w:bookmarkEnd w:id="50"/>
-    <w:bookmarkStart w:id="51" w:name="el-activo-son-los-clientes-fieles"/>
+    <w:bookmarkStart w:id="62" w:name="qué-ofrece-el-mercado"/>
     <w:p>
       <w:pPr>
         <w:pStyle w:val="Heading2"/>
       </w:pPr>
       <w:r>
-        <w:t xml:space="preserve">El activo son los clientes fieles</w:t>
+        <w:t xml:space="preserve">Qué ofrece el mercado</w:t>
       </w:r>
     </w:p>
     <w:p>
@@ -219,17 +404,34 @@
         <w:pStyle w:val="FirstParagraph"/>
       </w:pPr>
       <w:r>
-        <w:t xml:space="preserve">Con pocos clientes nuevos, retener y volver a venderles sostiene el negocio: el sistema aprovecha el historial y las preferencias de cada Cliente.</w:t>
+        <w:t xml:space="preserve">Se revisaron tres grupos de herramientas. La información de los productos surge de su documentación pública, consultada el 30/09/26; no se probó ninguno en profundidad.</w:t>
+      </w:r>
+    </w:p>
+    <w:bookmarkStart w:id="51" w:name="X9782274f35e89f72c06a189af852fc39d146154"/>
+    <w:p>
+      <w:pPr>
+        <w:pStyle w:val="Heading3"/>
+      </w:pPr>
+      <w:r>
+        <w:t xml:space="preserve">Herramientas de uso general: Excel, cuadernos y mensajería</w:t>
+      </w:r>
+    </w:p>
+    <w:p>
+      <w:pPr>
+        <w:pStyle w:val="FirstParagraph"/>
+      </w:pPr>
+      <w:r>
+        <w:t xml:space="preserve">Es lo que usa hoy la agencia. Son flexibles, gratuitas o ya pagas y todos las conocen, pero no avisan de un vencimiento, no relacionan un cobro con su viaje ni con su cliente, no registran quién hizo cada cambio y dependen de que alguien las mantenga al día.</w:t>
       </w:r>
     </w:p>
     <w:bookmarkEnd w:id="51"/>
-    <w:bookmarkStart w:id="52" w:name="las-herramientas-genéricas-no-alcanzan"/>
-    <w:p>
-      <w:pPr>
-        <w:pStyle w:val="Heading2"/>
-      </w:pPr>
-      <w:r>
-        <w:t xml:space="preserve">Las herramientas genéricas no alcanzan</w:t>
+    <w:bookmarkStart w:id="54" w:name="Xf5d2f6a7cd6b7d2b50e0f5b2b691ab9630d59bb"/>
+    <w:p>
+      <w:pPr>
+        <w:pStyle w:val="Heading3"/>
+      </w:pPr>
+      <w:r>
+        <w:t xml:space="preserve">CRM genéricos (por ejemplo, HubSpot y Pipedrive)</w:t>
       </w:r>
     </w:p>
     <w:p>
@@ -237,264 +439,191 @@
         <w:pStyle w:val="FirstParagraph"/>
       </w:pPr>
       <w:r>
-        <w:t xml:space="preserve">Ni Excel ni un CRM genérico entienden las reservas, las comisiones, las cuotas y los vencimientos propios del turismo.</w:t>
-      </w:r>
-    </w:p>
-    <w:bookmarkEnd w:id="52"/>
-    <w:bookmarkStart w:id="53" w:name="impacto-esperado"/>
-    <w:p>
-      <w:pPr>
-        <w:pStyle w:val="Heading2"/>
-      </w:pPr>
-      <w:r>
-        <w:t xml:space="preserve">Impacto esperado</w:t>
-      </w:r>
-    </w:p>
-    <w:p>
-      <w:pPr>
-        <w:pStyle w:val="FirstParagraph"/>
-      </w:pPr>
-      <w:r>
-        <w:t xml:space="preserve">Menos tiempo administrativo, menos vencimientos perdidos y más consultas que terminan en venta.</w:t>
-      </w:r>
-    </w:p>
-    <w:bookmarkEnd w:id="53"/>
-    <w:bookmarkStart w:id="54" w:name="como-proyecto-integrador"/>
-    <w:p>
-      <w:pPr>
-        <w:pStyle w:val="Heading2"/>
-      </w:pPr>
-      <w:r>
-        <w:t xml:space="preserve">Como proyecto integrador</w:t>
-      </w:r>
-    </w:p>
-    <w:p>
-      <w:pPr>
-        <w:pStyle w:val="FirstParagraph"/>
-      </w:pPr>
-      <w:r>
-        <w:t xml:space="preserve">Combina web, mobile, backend, base de datos relacional, API REST e IA sobre una problemática concreta y verificable.</w:t>
+        <w:t xml:space="preserve">Ordenan el</w:t>
+      </w:r>
+      <w:r>
+        <w:t xml:space="preserve"> </w:t>
+      </w:r>
+      <w:r>
+        <w:rPr>
+          <w:b/>
+          <w:bCs/>
+        </w:rPr>
+        <w:t xml:space="preserve">embudo de ventas</w:t>
+      </w:r>
+      <w:r>
+        <w:t xml:space="preserve">: contactos, oportunidades y etapas hasta el cierre. HubSpot tiene un plan gratuito con lo básico del embudo; Pipedrive es pago por usuario, con una prueba gratuita (</w:t>
+      </w:r>
+      <w:hyperlink r:id="rId52">
+        <w:r>
+          <w:rPr>
+            <w:rStyle w:val="Hyperlink"/>
+          </w:rPr>
+          <w:t xml:space="preserve">Pipedrive vs. HubSpot</w:t>
+        </w:r>
+      </w:hyperlink>
+      <w:r>
+        <w:t xml:space="preserve">,</w:t>
+      </w:r>
+      <w:r>
+        <w:t xml:space="preserve"> </w:t>
+      </w:r>
+      <w:hyperlink r:id="rId53">
+        <w:r>
+          <w:rPr>
+            <w:rStyle w:val="Hyperlink"/>
+          </w:rPr>
+          <w:t xml:space="preserve">Salesdorado</w:t>
+        </w:r>
+      </w:hyperlink>
+      <w:r>
+        <w:t xml:space="preserve">).</w:t>
+      </w:r>
+    </w:p>
+    <w:p>
+      <w:pPr>
+        <w:pStyle w:val="BodyText"/>
+      </w:pPr>
+      <w:r>
+        <w:t xml:space="preserve">Su límite para una agencia es que</w:t>
+      </w:r>
+      <w:r>
+        <w:t xml:space="preserve"> </w:t>
+      </w:r>
+      <w:r>
+        <w:rPr>
+          <w:b/>
+          <w:bCs/>
+        </w:rPr>
+        <w:t xml:space="preserve">no conocen el negocio del turismo</w:t>
+      </w:r>
+      <w:r>
+        <w:t xml:space="preserve">: no tienen la entidad viaje con su itinerario de hoteles, ni el plan de cuotas del pasajero, ni la deuda con el operador, ni la ganancia y la comisión por operación, ni los requisitos de ingreso de cada destino. Todo eso habría que armarlo con campos personalizados y mantenerlo a mano, que es justamente el problema de hoy.</w:t>
       </w:r>
     </w:p>
     <w:bookmarkEnd w:id="54"/>
-    <w:bookmarkEnd w:id="55"/>
-    <w:bookmarkStart w:id="61" w:name="herramientas-del-proyecto"/>
-    <w:p>
-      <w:pPr>
-        <w:pStyle w:val="Heading1"/>
-      </w:pPr>
-      <w:r>
-        <w:t xml:space="preserve">Herramientas del proyecto</w:t>
-      </w:r>
-    </w:p>
-    <w:p>
-      <w:pPr>
-        <w:pStyle w:val="FirstParagraph"/>
-      </w:pPr>
-      <w:r>
-        <w:t xml:space="preserve">Las dos herramientas transversales que el equipo eligió antes de empezar a trabajar: el</w:t>
-      </w:r>
-      <w:r>
-        <w:t xml:space="preserve"> </w:t>
-      </w:r>
-      <w:r>
-        <w:rPr>
-          <w:b/>
-          <w:bCs/>
-        </w:rPr>
-        <w:t xml:space="preserve">agente de inteligencia artificial</w:t>
-      </w:r>
-      <w:r>
-        <w:t xml:space="preserve"> </w:t>
-      </w:r>
-      <w:r>
-        <w:t xml:space="preserve">que acompaña el desarrollo y la</w:t>
-      </w:r>
-      <w:r>
-        <w:t xml:space="preserve"> </w:t>
-      </w:r>
-      <w:r>
-        <w:rPr>
-          <w:b/>
-          <w:bCs/>
-        </w:rPr>
-        <w:t xml:space="preserve">herramienta de modelado</w:t>
-      </w:r>
-      <w:r>
-        <w:t xml:space="preserve"> </w:t>
-      </w:r>
-      <w:r>
-        <w:t xml:space="preserve">con la que se construyen los diagramas.</w:t>
-      </w:r>
-    </w:p>
-    <w:bookmarkStart w:id="59" w:name="agente-de-ia-claude"/>
-    <w:p>
-      <w:pPr>
-        <w:pStyle w:val="Heading2"/>
-      </w:pPr>
-      <w:r>
-        <w:t xml:space="preserve">Agente de IA: Claude</w:t>
-      </w:r>
-    </w:p>
-    <w:p>
-      <w:pPr>
-        <w:pStyle w:val="FirstParagraph"/>
-      </w:pPr>
-      <w:r>
-        <w:t xml:space="preserve">Por acuerdo unánime de los tres integrantes se adoptó</w:t>
-      </w:r>
-      <w:r>
-        <w:t xml:space="preserve"> </w:t>
-      </w:r>
-      <w:r>
-        <w:rPr>
-          <w:b/>
-          <w:bCs/>
-        </w:rPr>
-        <w:t xml:space="preserve">Claude</w:t>
-      </w:r>
-      <w:r>
-        <w:t xml:space="preserve"> </w:t>
-      </w:r>
-      <w:r>
-        <w:t xml:space="preserve">(Anthropic) como agente de inteligencia artificial de trabajo. La elección se apoya en dos razones prácticas: los tres ya cuentan con la versión paga y todos tienen experiencia previa usándola en proyectos, lo que reduce la curva de aprendizaje y permite ser productivos desde el primer día.</w:t>
-      </w:r>
-    </w:p>
-    <w:bookmarkStart w:id="56" w:name="X60ff4f7d7f2b899924d69ccd4a68daa8b6ae4d1"/>
+    <w:bookmarkStart w:id="60" w:name="software-específico-de-turismo"/>
     <w:p>
       <w:pPr>
         <w:pStyle w:val="Heading3"/>
       </w:pPr>
       <w:r>
-        <w:t xml:space="preserve">Por qué es la mejor opción para este caso</w:t>
-      </w:r>
-    </w:p>
-    <w:p>
-      <w:pPr>
-        <w:pStyle w:val="Compact"/>
-        <w:numPr>
-          <w:ilvl w:val="0"/>
-          <w:numId w:val="1001"/>
-        </w:numPr>
-      </w:pPr>
-      <w:r>
-        <w:rPr>
-          <w:b/>
-          <w:bCs/>
-        </w:rPr>
-        <w:t xml:space="preserve">Ventana de contexto amplia:</w:t>
-      </w:r>
-      <w:r>
-        <w:t xml:space="preserve"> </w:t>
-      </w:r>
-      <w:r>
-        <w:t xml:space="preserve">permite trabajar con gran cantidad de información del proyecto (requisitos, código, documentación) en una sola conversación, algo útil para un sistema con varios módulos como Rumbo.</w:t>
-      </w:r>
-    </w:p>
-    <w:p>
-      <w:pPr>
-        <w:pStyle w:val="Compact"/>
-        <w:numPr>
-          <w:ilvl w:val="0"/>
-          <w:numId w:val="1001"/>
-        </w:numPr>
-      </w:pPr>
-      <w:r>
-        <w:rPr>
-          <w:b/>
-          <w:bCs/>
-        </w:rPr>
-        <w:t xml:space="preserve">Fortaleza en programación y razonamiento:</w:t>
-      </w:r>
-      <w:r>
-        <w:t xml:space="preserve"> </w:t>
-      </w:r>
-      <w:r>
-        <w:t xml:space="preserve">buen desempeño en generación y revisión de código y en el análisis de problemas, lo que acompaña bien un proyecto integrador con web, mobile, backend y API REST.</w:t>
-      </w:r>
-    </w:p>
-    <w:p>
-      <w:pPr>
-        <w:pStyle w:val="Compact"/>
-        <w:numPr>
-          <w:ilvl w:val="0"/>
-          <w:numId w:val="1001"/>
-        </w:numPr>
-      </w:pPr>
-      <w:r>
-        <w:rPr>
-          <w:b/>
-          <w:bCs/>
-        </w:rPr>
-        <w:t xml:space="preserve">Uso de herramientas y agente de código:</w:t>
-      </w:r>
-      <w:r>
-        <w:t xml:space="preserve"> </w:t>
-      </w:r>
-      <w:r>
-        <w:t xml:space="preserve">se integra con el flujo de desarrollo —por ejemplo, a través de Claude Code— para leer y editar archivos del proyecto, no solo responder preguntas sueltas.</w:t>
-      </w:r>
-    </w:p>
-    <w:p>
-      <w:pPr>
-        <w:pStyle w:val="Compact"/>
-        <w:numPr>
-          <w:ilvl w:val="0"/>
-          <w:numId w:val="1001"/>
-        </w:numPr>
-      </w:pPr>
-      <w:r>
-        <w:rPr>
-          <w:b/>
-          <w:bCs/>
-        </w:rPr>
-        <w:t xml:space="preserve">Experiencia previa del equipo:</w:t>
-      </w:r>
-      <w:r>
-        <w:t xml:space="preserve"> </w:t>
-      </w:r>
-      <w:r>
-        <w:t xml:space="preserve">al haberlo usado en otros proyectos, el equipo conoce su forma de trabajo y puede aprovecharlo mejor que una herramienta nueva.</w:t>
-      </w:r>
-    </w:p>
-    <w:p>
-      <w:pPr>
-        <w:pStyle w:val="Compact"/>
-        <w:numPr>
-          <w:ilvl w:val="0"/>
-          <w:numId w:val="1001"/>
-        </w:numPr>
-      </w:pPr>
-      <w:r>
-        <w:rPr>
-          <w:b/>
-          <w:bCs/>
-        </w:rPr>
-        <w:t xml:space="preserve">Disponibilidad inmediata:</w:t>
-      </w:r>
-      <w:r>
-        <w:t xml:space="preserve"> </w:t>
-      </w:r>
-      <w:r>
-        <w:t xml:space="preserve">los tres integrantes disponen de la versión paga, por lo que no hay costos ni gestiones adicionales para empezar a usarlo.</w:t>
-      </w:r>
-    </w:p>
-    <w:bookmarkEnd w:id="56"/>
-    <w:bookmarkStart w:id="57" w:name="comparativa-con-otras-herramientas-de-ia"/>
+        <w:t xml:space="preserve">Software específico de turismo</w:t>
+      </w:r>
+    </w:p>
+    <w:p>
+      <w:pPr>
+        <w:pStyle w:val="Compact"/>
+        <w:numPr>
+          <w:ilvl w:val="0"/>
+          <w:numId w:val="1002"/>
+        </w:numPr>
+      </w:pPr>
+      <w:r>
+        <w:rPr>
+          <w:b/>
+          <w:bCs/>
+        </w:rPr>
+        <w:t xml:space="preserve">CRM para agentes de viaje, en su mayoría de Estados Unidos</w:t>
+      </w:r>
+      <w:r>
+        <w:t xml:space="preserve"> </w:t>
+      </w:r>
+      <w:r>
+        <w:t xml:space="preserve">(por ejemplo, Tern, TravelJoy y Travefy): combinan CRM, armado de itinerarios, formularios para el cliente y, en algunos planes, conciliación de comisiones y pagos a proveedores. Se cobran por usuario y por mes, en dólares (</w:t>
+      </w:r>
+      <w:hyperlink r:id="rId55">
+        <w:r>
+          <w:rPr>
+            <w:rStyle w:val="Hyperlink"/>
+          </w:rPr>
+          <w:t xml:space="preserve">precios de Tern</w:t>
+        </w:r>
+      </w:hyperlink>
+      <w:r>
+        <w:t xml:space="preserve">,</w:t>
+      </w:r>
+      <w:r>
+        <w:t xml:space="preserve"> </w:t>
+      </w:r>
+      <w:hyperlink r:id="rId56">
+        <w:r>
+          <w:rPr>
+            <w:rStyle w:val="Hyperlink"/>
+          </w:rPr>
+          <w:t xml:space="preserve">DMC Quote</w:t>
+        </w:r>
+      </w:hyperlink>
+      <w:r>
+        <w:t xml:space="preserve">). Están pensados para el mercado estadounidense: en la documentación consultada no aparecen el español, el peso argentino, las cuotas del pasajero ni WhatsApp, que es el canal principal en Argentina (</w:t>
+      </w:r>
+      <w:hyperlink r:id="rId57">
+        <w:r>
+          <w:rPr>
+            <w:rStyle w:val="Hyperlink"/>
+          </w:rPr>
+          <w:t xml:space="preserve">Innovación Digital 360</w:t>
+        </w:r>
+      </w:hyperlink>
+      <w:r>
+        <w:t xml:space="preserve">).</w:t>
+      </w:r>
+    </w:p>
+    <w:p>
+      <w:pPr>
+        <w:pStyle w:val="Compact"/>
+        <w:numPr>
+          <w:ilvl w:val="0"/>
+          <w:numId w:val="1002"/>
+        </w:numPr>
+      </w:pPr>
+      <w:r>
+        <w:rPr>
+          <w:b/>
+          <w:bCs/>
+        </w:rPr>
+        <w:t xml:space="preserve">Sistemas de gestión (back office o ERP) para agencias argentinas</w:t>
+      </w:r>
+      <w:r>
+        <w:t xml:space="preserve"> </w:t>
+      </w:r>
+      <w:r>
+        <w:t xml:space="preserve">(por ejemplo, SAVIA): cubren la administración completa, con cotizaciones, reservas, contabilidad y facturación electrónica ante AFIP (</w:t>
+      </w:r>
+      <w:hyperlink r:id="rId58">
+        <w:r>
+          <w:rPr>
+            <w:rStyle w:val="Hyperlink"/>
+          </w:rPr>
+          <w:t xml:space="preserve">perfil de SAVIA</w:t>
+        </w:r>
+      </w:hyperlink>
+      <w:r>
+        <w:t xml:space="preserve">,</w:t>
+      </w:r>
+      <w:r>
+        <w:t xml:space="preserve"> </w:t>
+      </w:r>
+      <w:hyperlink r:id="rId59">
+        <w:r>
+          <w:rPr>
+            <w:rStyle w:val="Hyperlink"/>
+          </w:rPr>
+          <w:t xml:space="preserve">Hosteltur: qué es un back office</w:t>
+        </w:r>
+      </w:hyperlink>
+      <w:r>
+        <w:t xml:space="preserve">). Su foco es la administración y la contabilidad; la facturación, en particular, está fuera del alcance de Rumbo en esta etapa (Alcance y fuera de alcance).</w:t>
+      </w:r>
+    </w:p>
+    <w:bookmarkEnd w:id="60"/>
+    <w:bookmarkStart w:id="61" w:name="X40dfb3e71d2461426dc06aea8fec990643b5a60"/>
     <w:p>
       <w:pPr>
         <w:pStyle w:val="Heading3"/>
       </w:pPr>
       <w:r>
-        <w:t xml:space="preserve">Comparativa con otras herramientas de IA</w:t>
-      </w:r>
-    </w:p>
-    <w:p>
-      <w:pPr>
-        <w:pStyle w:val="FirstParagraph"/>
-      </w:pPr>
-      <w:r>
-        <w:t xml:space="preserve">Antes de decidir se compararon los principales asistentes de IA para desarrollo, considerando su enfoque, su desempeño en programación, el acceso del equipo y la experiencia previa:</w:t>
+        <w:t xml:space="preserve">Comparación con lo que necesita la agencia</w:t>
       </w:r>
     </w:p>
     <w:tbl>
@@ -522,6 +651,1005 @@
               <w:pStyle w:val="Compact"/>
             </w:pPr>
             <w:r>
+              <w:t xml:space="preserve">Necesidad de la agencia</w:t>
+            </w:r>
+          </w:p>
+        </w:tc>
+        <w:tc>
+          <w:tcPr/>
+          <w:p>
+            <w:pPr>
+              <w:pStyle w:val="Compact"/>
+            </w:pPr>
+            <w:r>
+              <w:t xml:space="preserve">Excel y mensajería</w:t>
+            </w:r>
+          </w:p>
+        </w:tc>
+        <w:tc>
+          <w:tcPr/>
+          <w:p>
+            <w:pPr>
+              <w:pStyle w:val="Compact"/>
+            </w:pPr>
+            <w:r>
+              <w:t xml:space="preserve">CRM genérico</w:t>
+            </w:r>
+          </w:p>
+        </w:tc>
+        <w:tc>
+          <w:tcPr/>
+          <w:p>
+            <w:pPr>
+              <w:pStyle w:val="Compact"/>
+            </w:pPr>
+            <w:r>
+              <w:t xml:space="preserve">CRM de turismo de EE. UU.</w:t>
+            </w:r>
+          </w:p>
+        </w:tc>
+        <w:tc>
+          <w:tcPr/>
+          <w:p>
+            <w:pPr>
+              <w:pStyle w:val="Compact"/>
+            </w:pPr>
+            <w:r>
+              <w:t xml:space="preserve">Rumbo</w:t>
+            </w:r>
+          </w:p>
+        </w:tc>
+      </w:tr>
+      <w:tr>
+        <w:tc>
+          <w:tcPr/>
+          <w:p>
+            <w:pPr>
+              <w:pStyle w:val="Compact"/>
+            </w:pPr>
+            <w:r>
+              <w:t xml:space="preserve">Seguir la consulta hasta la venta</w:t>
+            </w:r>
+          </w:p>
+        </w:tc>
+        <w:tc>
+          <w:tcPr/>
+          <w:p>
+            <w:pPr>
+              <w:pStyle w:val="Compact"/>
+            </w:pPr>
+            <w:r>
+              <w:t xml:space="preserve">A mano</w:t>
+            </w:r>
+          </w:p>
+        </w:tc>
+        <w:tc>
+          <w:tcPr/>
+          <w:p>
+            <w:pPr>
+              <w:pStyle w:val="Compact"/>
+            </w:pPr>
+            <w:r>
+              <w:t xml:space="preserve">Sí</w:t>
+            </w:r>
+          </w:p>
+        </w:tc>
+        <w:tc>
+          <w:tcPr/>
+          <w:p>
+            <w:pPr>
+              <w:pStyle w:val="Compact"/>
+            </w:pPr>
+            <w:r>
+              <w:t xml:space="preserve">Sí</w:t>
+            </w:r>
+          </w:p>
+        </w:tc>
+        <w:tc>
+          <w:tcPr/>
+          <w:p>
+            <w:pPr>
+              <w:pStyle w:val="Compact"/>
+            </w:pPr>
+            <w:r>
+              <w:t xml:space="preserve">Sí (CU-01)</w:t>
+            </w:r>
+          </w:p>
+        </w:tc>
+      </w:tr>
+      <w:tr>
+        <w:tc>
+          <w:tcPr/>
+          <w:p>
+            <w:pPr>
+              <w:pStyle w:val="Compact"/>
+            </w:pPr>
+            <w:r>
+              <w:t xml:space="preserve">Viaje con itinerario, operador y economía propia</w:t>
+            </w:r>
+          </w:p>
+        </w:tc>
+        <w:tc>
+          <w:tcPr/>
+          <w:p>
+            <w:pPr>
+              <w:pStyle w:val="Compact"/>
+            </w:pPr>
+            <w:r>
+              <w:t xml:space="preserve">A mano</w:t>
+            </w:r>
+          </w:p>
+        </w:tc>
+        <w:tc>
+          <w:tcPr/>
+          <w:p>
+            <w:pPr>
+              <w:pStyle w:val="Compact"/>
+            </w:pPr>
+            <w:r>
+              <w:t xml:space="preserve">No, con campos a medida</w:t>
+            </w:r>
+          </w:p>
+        </w:tc>
+        <w:tc>
+          <w:tcPr/>
+          <w:p>
+            <w:pPr>
+              <w:pStyle w:val="Compact"/>
+            </w:pPr>
+            <w:r>
+              <w:t xml:space="preserve">Sí</w:t>
+            </w:r>
+          </w:p>
+        </w:tc>
+        <w:tc>
+          <w:tcPr/>
+          <w:p>
+            <w:pPr>
+              <w:pStyle w:val="Compact"/>
+            </w:pPr>
+            <w:r>
+              <w:t xml:space="preserve">Sí</w:t>
+            </w:r>
+          </w:p>
+        </w:tc>
+      </w:tr>
+      <w:tr>
+        <w:tc>
+          <w:tcPr/>
+          <w:p>
+            <w:pPr>
+              <w:pStyle w:val="Compact"/>
+            </w:pPr>
+            <w:r>
+              <w:t xml:space="preserve">Plan de cuotas y vencimientos del pasajero y del operador</w:t>
+            </w:r>
+          </w:p>
+        </w:tc>
+        <w:tc>
+          <w:tcPr/>
+          <w:p>
+            <w:pPr>
+              <w:pStyle w:val="Compact"/>
+            </w:pPr>
+            <w:r>
+              <w:t xml:space="preserve">A mano, sin avisos</w:t>
+            </w:r>
+          </w:p>
+        </w:tc>
+        <w:tc>
+          <w:tcPr/>
+          <w:p>
+            <w:pPr>
+              <w:pStyle w:val="Compact"/>
+            </w:pPr>
+            <w:r>
+              <w:t xml:space="preserve">No</w:t>
+            </w:r>
+          </w:p>
+        </w:tc>
+        <w:tc>
+          <w:tcPr/>
+          <w:p>
+            <w:pPr>
+              <w:pStyle w:val="Compact"/>
+            </w:pPr>
+            <w:r>
+              <w:t xml:space="preserve">Parcial</w:t>
+            </w:r>
+          </w:p>
+        </w:tc>
+        <w:tc>
+          <w:tcPr/>
+          <w:p>
+            <w:pPr>
+              <w:pStyle w:val="Compact"/>
+            </w:pPr>
+            <w:r>
+              <w:t xml:space="preserve">Sí, con alertas</w:t>
+            </w:r>
+          </w:p>
+        </w:tc>
+      </w:tr>
+      <w:tr>
+        <w:tc>
+          <w:tcPr/>
+          <w:p>
+            <w:pPr>
+              <w:pStyle w:val="Compact"/>
+            </w:pPr>
+            <w:r>
+              <w:t xml:space="preserve">Ganancia, margen y comisión del vendedor freelance, en ARS o USD</w:t>
+            </w:r>
+          </w:p>
+        </w:tc>
+        <w:tc>
+          <w:tcPr/>
+          <w:p>
+            <w:pPr>
+              <w:pStyle w:val="Compact"/>
+            </w:pPr>
+            <w:r>
+              <w:t xml:space="preserve">A mano</w:t>
+            </w:r>
+          </w:p>
+        </w:tc>
+        <w:tc>
+          <w:tcPr/>
+          <w:p>
+            <w:pPr>
+              <w:pStyle w:val="Compact"/>
+            </w:pPr>
+            <w:r>
+              <w:t xml:space="preserve">No</w:t>
+            </w:r>
+          </w:p>
+        </w:tc>
+        <w:tc>
+          <w:tcPr/>
+          <w:p>
+            <w:pPr>
+              <w:pStyle w:val="Compact"/>
+            </w:pPr>
+            <w:r>
+              <w:t xml:space="preserve">Parcial, en USD</w:t>
+            </w:r>
+          </w:p>
+        </w:tc>
+        <w:tc>
+          <w:tcPr/>
+          <w:p>
+            <w:pPr>
+              <w:pStyle w:val="Compact"/>
+            </w:pPr>
+            <w:r>
+              <w:t xml:space="preserve">Sí</w:t>
+            </w:r>
+          </w:p>
+        </w:tc>
+      </w:tr>
+      <w:tr>
+        <w:tc>
+          <w:tcPr/>
+          <w:p>
+            <w:pPr>
+              <w:pStyle w:val="Compact"/>
+            </w:pPr>
+            <w:r>
+              <w:t xml:space="preserve">Recordatorios según los requisitos de cada destino</w:t>
+            </w:r>
+          </w:p>
+        </w:tc>
+        <w:tc>
+          <w:tcPr/>
+          <w:p>
+            <w:pPr>
+              <w:pStyle w:val="Compact"/>
+            </w:pPr>
+            <w:r>
+              <w:t xml:space="preserve">No</w:t>
+            </w:r>
+          </w:p>
+        </w:tc>
+        <w:tc>
+          <w:tcPr/>
+          <w:p>
+            <w:pPr>
+              <w:pStyle w:val="Compact"/>
+            </w:pPr>
+            <w:r>
+              <w:t xml:space="preserve">No</w:t>
+            </w:r>
+          </w:p>
+        </w:tc>
+        <w:tc>
+          <w:tcPr/>
+          <w:p>
+            <w:pPr>
+              <w:pStyle w:val="Compact"/>
+            </w:pPr>
+            <w:r>
+              <w:t xml:space="preserve">No se encontró</w:t>
+            </w:r>
+          </w:p>
+        </w:tc>
+        <w:tc>
+          <w:tcPr/>
+          <w:p>
+            <w:pPr>
+              <w:pStyle w:val="Compact"/>
+            </w:pPr>
+            <w:r>
+              <w:t xml:space="preserve">Sí (CU-15)</w:t>
+            </w:r>
+          </w:p>
+        </w:tc>
+      </w:tr>
+      <w:tr>
+        <w:tc>
+          <w:tcPr/>
+          <w:p>
+            <w:pPr>
+              <w:pStyle w:val="Compact"/>
+            </w:pPr>
+            <w:r>
+              <w:t xml:space="preserve">Aviso para volver a contactar a los clientes fieles</w:t>
+            </w:r>
+          </w:p>
+        </w:tc>
+        <w:tc>
+          <w:tcPr/>
+          <w:p>
+            <w:pPr>
+              <w:pStyle w:val="Compact"/>
+            </w:pPr>
+            <w:r>
+              <w:t xml:space="preserve">No</w:t>
+            </w:r>
+          </w:p>
+        </w:tc>
+        <w:tc>
+          <w:tcPr/>
+          <w:p>
+            <w:pPr>
+              <w:pStyle w:val="Compact"/>
+            </w:pPr>
+            <w:r>
+              <w:t xml:space="preserve">Con automatizaciones a medida</w:t>
+            </w:r>
+          </w:p>
+        </w:tc>
+        <w:tc>
+          <w:tcPr/>
+          <w:p>
+            <w:pPr>
+              <w:pStyle w:val="Compact"/>
+            </w:pPr>
+            <w:r>
+              <w:t xml:space="preserve">No se encontró</w:t>
+            </w:r>
+          </w:p>
+        </w:tc>
+        <w:tc>
+          <w:tcPr/>
+          <w:p>
+            <w:pPr>
+              <w:pStyle w:val="Compact"/>
+            </w:pPr>
+            <w:r>
+              <w:t xml:space="preserve">Sí (CU-30)</w:t>
+            </w:r>
+          </w:p>
+        </w:tc>
+      </w:tr>
+      <w:tr>
+        <w:tc>
+          <w:tcPr/>
+          <w:p>
+            <w:pPr>
+              <w:pStyle w:val="Compact"/>
+            </w:pPr>
+            <w:r>
+              <w:t xml:space="preserve">Rol freelance que ve solo lo suyo</w:t>
+            </w:r>
+          </w:p>
+        </w:tc>
+        <w:tc>
+          <w:tcPr/>
+          <w:p>
+            <w:pPr>
+              <w:pStyle w:val="Compact"/>
+            </w:pPr>
+            <w:r>
+              <w:t xml:space="preserve">No</w:t>
+            </w:r>
+          </w:p>
+        </w:tc>
+        <w:tc>
+          <w:tcPr/>
+          <w:p>
+            <w:pPr>
+              <w:pStyle w:val="Compact"/>
+            </w:pPr>
+            <w:r>
+              <w:t xml:space="preserve">Según el plan</w:t>
+            </w:r>
+          </w:p>
+        </w:tc>
+        <w:tc>
+          <w:tcPr/>
+          <w:p>
+            <w:pPr>
+              <w:pStyle w:val="Compact"/>
+            </w:pPr>
+            <w:r>
+              <w:t xml:space="preserve">No se encontró</w:t>
+            </w:r>
+          </w:p>
+        </w:tc>
+        <w:tc>
+          <w:tcPr/>
+          <w:p>
+            <w:pPr>
+              <w:pStyle w:val="Compact"/>
+            </w:pPr>
+            <w:r>
+              <w:t xml:space="preserve">Sí</w:t>
+            </w:r>
+          </w:p>
+        </w:tc>
+      </w:tr>
+      <w:tr>
+        <w:tc>
+          <w:tcPr/>
+          <w:p>
+            <w:pPr>
+              <w:pStyle w:val="Compact"/>
+            </w:pPr>
+            <w:r>
+              <w:t xml:space="preserve">Español, pesos argentinos y costo acorde a una PyME</w:t>
+            </w:r>
+          </w:p>
+        </w:tc>
+        <w:tc>
+          <w:tcPr/>
+          <w:p>
+            <w:pPr>
+              <w:pStyle w:val="Compact"/>
+            </w:pPr>
+            <w:r>
+              <w:t xml:space="preserve">Sí</w:t>
+            </w:r>
+          </w:p>
+        </w:tc>
+        <w:tc>
+          <w:tcPr/>
+          <w:p>
+            <w:pPr>
+              <w:pStyle w:val="Compact"/>
+            </w:pPr>
+            <w:r>
+              <w:t xml:space="preserve">Parcial</w:t>
+            </w:r>
+          </w:p>
+        </w:tc>
+        <w:tc>
+          <w:tcPr/>
+          <w:p>
+            <w:pPr>
+              <w:pStyle w:val="Compact"/>
+            </w:pPr>
+            <w:r>
+              <w:t xml:space="preserve">No</w:t>
+            </w:r>
+          </w:p>
+        </w:tc>
+        <w:tc>
+          <w:tcPr/>
+          <w:p>
+            <w:pPr>
+              <w:pStyle w:val="Compact"/>
+            </w:pPr>
+            <w:r>
+              <w:t xml:space="preserve">Sí</w:t>
+            </w:r>
+          </w:p>
+        </w:tc>
+      </w:tr>
+    </w:tbl>
+    <w:p>
+      <w:pPr>
+        <w:pStyle w:val="BodyText"/>
+      </w:pPr>
+      <w:r>
+        <w:t xml:space="preserve">Los casilleros «no se encontró» indican que la documentación pública consultada no lo menciona, no que el producto no lo tenga.</w:t>
+      </w:r>
+    </w:p>
+    <w:bookmarkEnd w:id="61"/>
+    <w:bookmarkEnd w:id="62"/>
+    <w:bookmarkStart w:id="63" w:name="por-qué-no-alcanzan"/>
+    <w:p>
+      <w:pPr>
+        <w:pStyle w:val="Heading2"/>
+      </w:pPr>
+      <w:r>
+        <w:t xml:space="preserve">Por qué no alcanzan</w:t>
+      </w:r>
+    </w:p>
+    <w:p>
+      <w:pPr>
+        <w:pStyle w:val="Compact"/>
+        <w:numPr>
+          <w:ilvl w:val="0"/>
+          <w:numId w:val="1003"/>
+        </w:numPr>
+      </w:pPr>
+      <w:r>
+        <w:t xml:space="preserve">Las</w:t>
+      </w:r>
+      <w:r>
+        <w:t xml:space="preserve"> </w:t>
+      </w:r>
+      <w:r>
+        <w:rPr>
+          <w:b/>
+          <w:bCs/>
+        </w:rPr>
+        <w:t xml:space="preserve">herramientas generales</w:t>
+      </w:r>
+      <w:r>
+        <w:t xml:space="preserve"> </w:t>
+      </w:r>
+      <w:r>
+        <w:t xml:space="preserve">son las que causan el problema actual: dependen de la memoria de las personas.</w:t>
+      </w:r>
+    </w:p>
+    <w:p>
+      <w:pPr>
+        <w:pStyle w:val="Compact"/>
+        <w:numPr>
+          <w:ilvl w:val="0"/>
+          <w:numId w:val="1003"/>
+        </w:numPr>
+      </w:pPr>
+      <w:r>
+        <w:t xml:space="preserve">Los</w:t>
+      </w:r>
+      <w:r>
+        <w:t xml:space="preserve"> </w:t>
+      </w:r>
+      <w:r>
+        <w:rPr>
+          <w:b/>
+          <w:bCs/>
+        </w:rPr>
+        <w:t xml:space="preserve">CRM genéricos</w:t>
+      </w:r>
+      <w:r>
+        <w:t xml:space="preserve"> </w:t>
+      </w:r>
+      <w:r>
+        <w:t xml:space="preserve">resuelven el embudo, pero no el viaje, los cobros en cuotas ni los vencimientos, que son el centro del negocio.</w:t>
+      </w:r>
+    </w:p>
+    <w:p>
+      <w:pPr>
+        <w:pStyle w:val="Compact"/>
+        <w:numPr>
+          <w:ilvl w:val="0"/>
+          <w:numId w:val="1003"/>
+        </w:numPr>
+      </w:pPr>
+      <w:r>
+        <w:t xml:space="preserve">Los</w:t>
+      </w:r>
+      <w:r>
+        <w:t xml:space="preserve"> </w:t>
+      </w:r>
+      <w:r>
+        <w:rPr>
+          <w:b/>
+          <w:bCs/>
+        </w:rPr>
+        <w:t xml:space="preserve">CRM de turismo del exterior</w:t>
+      </w:r>
+      <w:r>
+        <w:t xml:space="preserve"> </w:t>
+      </w:r>
+      <w:r>
+        <w:t xml:space="preserve">se acercan en funciones, pero están pensados para otro mercado: otro idioma, otra moneda, sin cuotas ni WhatsApp y con un costo mensual en dólares por usuario.</w:t>
+      </w:r>
+    </w:p>
+    <w:p>
+      <w:pPr>
+        <w:pStyle w:val="Compact"/>
+        <w:numPr>
+          <w:ilvl w:val="0"/>
+          <w:numId w:val="1003"/>
+        </w:numPr>
+      </w:pPr>
+      <w:r>
+        <w:t xml:space="preserve">Los</w:t>
+      </w:r>
+      <w:r>
+        <w:t xml:space="preserve"> </w:t>
+      </w:r>
+      <w:r>
+        <w:rPr>
+          <w:b/>
+          <w:bCs/>
+        </w:rPr>
+        <w:t xml:space="preserve">back office argentinos</w:t>
+      </w:r>
+      <w:r>
+        <w:t xml:space="preserve"> </w:t>
+      </w:r>
+      <w:r>
+        <w:t xml:space="preserve">apuntan a la administración y la facturación de la agencia, más que al seguimiento comercial y a la fidelización de clientes, que es lo que más le preocupa a esta agencia.</w:t>
+      </w:r>
+    </w:p>
+    <w:p>
+      <w:pPr>
+        <w:pStyle w:val="FirstParagraph"/>
+      </w:pPr>
+      <w:r>
+        <w:t xml:space="preserve">Rumbo toma de cada grupo lo que la agencia necesita (el embudo de un CRM y el modelo del viaje y sus cobros de un sistema de turismo) y le suma lo propio de este caso: alertas por destino, recontacto de clientes fieles, vendedores freelance y multimoneda, a la medida de una PyME argentina.</w:t>
+      </w:r>
+    </w:p>
+    <w:bookmarkEnd w:id="63"/>
+    <w:bookmarkEnd w:id="64"/>
+    <w:bookmarkStart w:id="70" w:name="justificación-del-sistema"/>
+    <w:p>
+      <w:pPr>
+        <w:pStyle w:val="Heading1"/>
+      </w:pPr>
+      <w:r>
+        <w:t xml:space="preserve">Justificación del sistema</w:t>
+      </w:r>
+    </w:p>
+    <w:p>
+      <w:pPr>
+        <w:pStyle w:val="FirstParagraph"/>
+      </w:pPr>
+      <w:r>
+        <w:t xml:space="preserve">Por qué vale la pena construir Rumbo: el trabajo manual de la agencia genera problemas concretos que un sistema a medida resuelve mejor que Excel o un CRM genérico.</w:t>
+      </w:r>
+    </w:p>
+    <w:bookmarkStart w:id="65" w:name="un-problema-real-y-costoso"/>
+    <w:p>
+      <w:pPr>
+        <w:pStyle w:val="Heading2"/>
+      </w:pPr>
+      <w:r>
+        <w:t xml:space="preserve">Un problema real y costoso</w:t>
+      </w:r>
+    </w:p>
+    <w:p>
+      <w:pPr>
+        <w:pStyle w:val="FirstParagraph"/>
+      </w:pPr>
+      <w:r>
+        <w:t xml:space="preserve">Gestionar en papel y Excel hace que se pierdan ventas, se olviden cobros y no quede memoria del cliente.</w:t>
+      </w:r>
+    </w:p>
+    <w:bookmarkEnd w:id="65"/>
+    <w:bookmarkStart w:id="66" w:name="el-activo-son-los-clientes-fieles"/>
+    <w:p>
+      <w:pPr>
+        <w:pStyle w:val="Heading2"/>
+      </w:pPr>
+      <w:r>
+        <w:t xml:space="preserve">El activo son los clientes fieles</w:t>
+      </w:r>
+    </w:p>
+    <w:p>
+      <w:pPr>
+        <w:pStyle w:val="FirstParagraph"/>
+      </w:pPr>
+      <w:r>
+        <w:t xml:space="preserve">Con pocos clientes nuevos, retener y volver a venderles sostiene el negocio: el sistema aprovecha el historial y las preferencias de cada Cliente.</w:t>
+      </w:r>
+    </w:p>
+    <w:bookmarkEnd w:id="66"/>
+    <w:bookmarkStart w:id="67" w:name="las-herramientas-genéricas-no-alcanzan"/>
+    <w:p>
+      <w:pPr>
+        <w:pStyle w:val="Heading2"/>
+      </w:pPr>
+      <w:r>
+        <w:t xml:space="preserve">Las herramientas genéricas no alcanzan</w:t>
+      </w:r>
+    </w:p>
+    <w:p>
+      <w:pPr>
+        <w:pStyle w:val="FirstParagraph"/>
+      </w:pPr>
+      <w:r>
+        <w:t xml:space="preserve">Ni Excel ni un CRM genérico entienden las reservas, las comisiones, las cuotas y los vencimientos propios del turismo.</w:t>
+      </w:r>
+    </w:p>
+    <w:bookmarkEnd w:id="67"/>
+    <w:bookmarkStart w:id="68" w:name="impacto-esperado"/>
+    <w:p>
+      <w:pPr>
+        <w:pStyle w:val="Heading2"/>
+      </w:pPr>
+      <w:r>
+        <w:t xml:space="preserve">Impacto esperado</w:t>
+      </w:r>
+    </w:p>
+    <w:p>
+      <w:pPr>
+        <w:pStyle w:val="FirstParagraph"/>
+      </w:pPr>
+      <w:r>
+        <w:t xml:space="preserve">Menos tiempo administrativo, menos vencimientos perdidos y más consultas que terminan en venta.</w:t>
+      </w:r>
+    </w:p>
+    <w:bookmarkEnd w:id="68"/>
+    <w:bookmarkStart w:id="69" w:name="como-proyecto-integrador"/>
+    <w:p>
+      <w:pPr>
+        <w:pStyle w:val="Heading2"/>
+      </w:pPr>
+      <w:r>
+        <w:t xml:space="preserve">Como proyecto integrador</w:t>
+      </w:r>
+    </w:p>
+    <w:p>
+      <w:pPr>
+        <w:pStyle w:val="FirstParagraph"/>
+      </w:pPr>
+      <w:r>
+        <w:t xml:space="preserve">Combina web, mobile, backend, base de datos relacional, API REST e IA sobre una problemática concreta y verificable.</w:t>
+      </w:r>
+    </w:p>
+    <w:bookmarkEnd w:id="69"/>
+    <w:bookmarkEnd w:id="70"/>
+    <w:bookmarkStart w:id="76" w:name="herramientas-del-proyecto"/>
+    <w:p>
+      <w:pPr>
+        <w:pStyle w:val="Heading1"/>
+      </w:pPr>
+      <w:r>
+        <w:t xml:space="preserve">Herramientas del proyecto</w:t>
+      </w:r>
+    </w:p>
+    <w:p>
+      <w:pPr>
+        <w:pStyle w:val="FirstParagraph"/>
+      </w:pPr>
+      <w:r>
+        <w:t xml:space="preserve">Las dos herramientas transversales que el equipo eligió antes de empezar a trabajar: el</w:t>
+      </w:r>
+      <w:r>
+        <w:t xml:space="preserve"> </w:t>
+      </w:r>
+      <w:r>
+        <w:rPr>
+          <w:b/>
+          <w:bCs/>
+        </w:rPr>
+        <w:t xml:space="preserve">agente de inteligencia artificial</w:t>
+      </w:r>
+      <w:r>
+        <w:t xml:space="preserve"> </w:t>
+      </w:r>
+      <w:r>
+        <w:t xml:space="preserve">que acompaña el desarrollo y la</w:t>
+      </w:r>
+      <w:r>
+        <w:t xml:space="preserve"> </w:t>
+      </w:r>
+      <w:r>
+        <w:rPr>
+          <w:b/>
+          <w:bCs/>
+        </w:rPr>
+        <w:t xml:space="preserve">herramienta de modelado</w:t>
+      </w:r>
+      <w:r>
+        <w:t xml:space="preserve"> </w:t>
+      </w:r>
+      <w:r>
+        <w:t xml:space="preserve">con la que se construyen los diagramas.</w:t>
+      </w:r>
+    </w:p>
+    <w:bookmarkStart w:id="74" w:name="agente-de-ia-claude"/>
+    <w:p>
+      <w:pPr>
+        <w:pStyle w:val="Heading2"/>
+      </w:pPr>
+      <w:r>
+        <w:t xml:space="preserve">Agente de IA: Claude</w:t>
+      </w:r>
+    </w:p>
+    <w:p>
+      <w:pPr>
+        <w:pStyle w:val="FirstParagraph"/>
+      </w:pPr>
+      <w:r>
+        <w:t xml:space="preserve">Por acuerdo unánime de los tres integrantes se adoptó</w:t>
+      </w:r>
+      <w:r>
+        <w:t xml:space="preserve"> </w:t>
+      </w:r>
+      <w:r>
+        <w:rPr>
+          <w:b/>
+          <w:bCs/>
+        </w:rPr>
+        <w:t xml:space="preserve">Claude</w:t>
+      </w:r>
+      <w:r>
+        <w:t xml:space="preserve"> </w:t>
+      </w:r>
+      <w:r>
+        <w:t xml:space="preserve">(Anthropic) como agente de inteligencia artificial de trabajo. La elección se apoya en dos razones prácticas: los tres ya cuentan con la versión paga y todos tienen experiencia previa usándola en proyectos, lo que reduce la curva de aprendizaje y permite ser productivos desde el primer día.</w:t>
+      </w:r>
+    </w:p>
+    <w:bookmarkStart w:id="71" w:name="X60ff4f7d7f2b899924d69ccd4a68daa8b6ae4d1"/>
+    <w:p>
+      <w:pPr>
+        <w:pStyle w:val="Heading3"/>
+      </w:pPr>
+      <w:r>
+        <w:t xml:space="preserve">Por qué es la mejor opción para este caso</w:t>
+      </w:r>
+    </w:p>
+    <w:p>
+      <w:pPr>
+        <w:pStyle w:val="Compact"/>
+        <w:numPr>
+          <w:ilvl w:val="0"/>
+          <w:numId w:val="1004"/>
+        </w:numPr>
+      </w:pPr>
+      <w:r>
+        <w:rPr>
+          <w:b/>
+          <w:bCs/>
+        </w:rPr>
+        <w:t xml:space="preserve">Ventana de contexto amplia:</w:t>
+      </w:r>
+      <w:r>
+        <w:t xml:space="preserve"> </w:t>
+      </w:r>
+      <w:r>
+        <w:t xml:space="preserve">permite trabajar con gran cantidad de información del proyecto (requisitos, código, documentación) en una sola conversación, algo útil para un sistema con varios módulos como Rumbo.</w:t>
+      </w:r>
+    </w:p>
+    <w:p>
+      <w:pPr>
+        <w:pStyle w:val="Compact"/>
+        <w:numPr>
+          <w:ilvl w:val="0"/>
+          <w:numId w:val="1004"/>
+        </w:numPr>
+      </w:pPr>
+      <w:r>
+        <w:rPr>
+          <w:b/>
+          <w:bCs/>
+        </w:rPr>
+        <w:t xml:space="preserve">Fortaleza en programación y razonamiento:</w:t>
+      </w:r>
+      <w:r>
+        <w:t xml:space="preserve"> </w:t>
+      </w:r>
+      <w:r>
+        <w:t xml:space="preserve">buen desempeño en generación y revisión de código y en el análisis de problemas, lo que acompaña bien un proyecto integrador con web, mobile, backend y API REST.</w:t>
+      </w:r>
+    </w:p>
+    <w:p>
+      <w:pPr>
+        <w:pStyle w:val="Compact"/>
+        <w:numPr>
+          <w:ilvl w:val="0"/>
+          <w:numId w:val="1004"/>
+        </w:numPr>
+      </w:pPr>
+      <w:r>
+        <w:rPr>
+          <w:b/>
+          <w:bCs/>
+        </w:rPr>
+        <w:t xml:space="preserve">Uso de herramientas y agente de código:</w:t>
+      </w:r>
+      <w:r>
+        <w:t xml:space="preserve"> </w:t>
+      </w:r>
+      <w:r>
+        <w:t xml:space="preserve">se integra con el flujo de desarrollo —por ejemplo, a través de Claude Code— para leer y editar archivos del proyecto, no solo responder preguntas sueltas.</w:t>
+      </w:r>
+    </w:p>
+    <w:p>
+      <w:pPr>
+        <w:pStyle w:val="Compact"/>
+        <w:numPr>
+          <w:ilvl w:val="0"/>
+          <w:numId w:val="1004"/>
+        </w:numPr>
+      </w:pPr>
+      <w:r>
+        <w:rPr>
+          <w:b/>
+          <w:bCs/>
+        </w:rPr>
+        <w:t xml:space="preserve">Experiencia previa del equipo:</w:t>
+      </w:r>
+      <w:r>
+        <w:t xml:space="preserve"> </w:t>
+      </w:r>
+      <w:r>
+        <w:t xml:space="preserve">al haberlo usado en otros proyectos, el equipo conoce su forma de trabajo y puede aprovecharlo mejor que una herramienta nueva.</w:t>
+      </w:r>
+    </w:p>
+    <w:p>
+      <w:pPr>
+        <w:pStyle w:val="Compact"/>
+        <w:numPr>
+          <w:ilvl w:val="0"/>
+          <w:numId w:val="1004"/>
+        </w:numPr>
+      </w:pPr>
+      <w:r>
+        <w:rPr>
+          <w:b/>
+          <w:bCs/>
+        </w:rPr>
+        <w:t xml:space="preserve">Disponibilidad inmediata:</w:t>
+      </w:r>
+      <w:r>
+        <w:t xml:space="preserve"> </w:t>
+      </w:r>
+      <w:r>
+        <w:t xml:space="preserve">los tres integrantes disponen de la versión paga, por lo que no hay costos ni gestiones adicionales para empezar a usarlo.</w:t>
+      </w:r>
+    </w:p>
+    <w:bookmarkEnd w:id="71"/>
+    <w:bookmarkStart w:id="72" w:name="comparativa-con-otras-herramientas-de-ia"/>
+    <w:p>
+      <w:pPr>
+        <w:pStyle w:val="Heading3"/>
+      </w:pPr>
+      <w:r>
+        <w:t xml:space="preserve">Comparativa con otras herramientas de IA</w:t>
+      </w:r>
+    </w:p>
+    <w:p>
+      <w:pPr>
+        <w:pStyle w:val="FirstParagraph"/>
+      </w:pPr>
+      <w:r>
+        <w:t xml:space="preserve">Antes de decidir se compararon los principales asistentes de IA para desarrollo, considerando su enfoque, su desempeño en programación, el acceso del equipo y la experiencia previa:</w:t>
+      </w:r>
+    </w:p>
+    <w:tbl>
+      <w:tblPr>
+        <w:tblStyle w:val="Table"/>
+        <w:tblW w:type="pct" w:w="5000"/>
+        <w:tblLayout w:type="fixed"/>
+        <w:tblLook w:firstRow="1" w:lastRow="0" w:firstColumn="0" w:lastColumn="0" w:noHBand="0" w:noVBand="0" w:val="0020"/>
+      </w:tblPr>
+      <w:tblGrid>
+        <w:gridCol w:w="1584"/>
+        <w:gridCol w:w="1584"/>
+        <w:gridCol w:w="1584"/>
+        <w:gridCol w:w="1584"/>
+        <w:gridCol w:w="1584"/>
+      </w:tblGrid>
+      <w:tr>
+        <w:trPr>
+          <w:tblHeader w:val="on"/>
+        </w:trPr>
+        <w:tc>
+          <w:tcPr/>
+          <w:p>
+            <w:pPr>
+              <w:pStyle w:val="Compact"/>
+            </w:pPr>
+            <w:r>
               <w:t xml:space="preserve">Herramienta</w:t>
             </w:r>
           </w:p>
@@ -901,8 +2029,8 @@
         <w:t xml:space="preserve">el equipo ya está acostumbrado a usar Claude por haberla utilizado en otros proyectos, lo que reduce la curva de aprendizaje, y los tres cuentan con la versión paga; eso los deja productivos desde el primer día sin costos ni gestiones adicionales.</w:t>
       </w:r>
     </w:p>
-    <w:bookmarkEnd w:id="57"/>
-    <w:bookmarkStart w:id="58" w:name="X7e2dd9a6045d325b4801de4b73883c31fd68a45"/>
+    <w:bookmarkEnd w:id="72"/>
+    <w:bookmarkStart w:id="73" w:name="X7e2dd9a6045d325b4801de4b73883c31fd68a45"/>
     <w:p>
       <w:pPr>
         <w:pStyle w:val="Heading3"/>
@@ -1249,9 +2377,9 @@
         <w:t xml:space="preserve">Los agentes que usa el equipo, y el enlace a la decisión sobre el modelo del producto, están en IA — Agentes del proyecto.</w:t>
       </w:r>
     </w:p>
-    <w:bookmarkEnd w:id="58"/>
-    <w:bookmarkEnd w:id="59"/>
-    <w:bookmarkStart w:id="60" w:name="herramienta-de-modelado-mermaid"/>
+    <w:bookmarkEnd w:id="73"/>
+    <w:bookmarkEnd w:id="74"/>
+    <w:bookmarkStart w:id="75" w:name="herramienta-de-modelado-mermaid"/>
     <w:p>
       <w:pPr>
         <w:pStyle w:val="Heading2"/>
@@ -1286,7 +2414,7 @@
         <w:pStyle w:val="Compact"/>
         <w:numPr>
           <w:ilvl w:val="0"/>
-          <w:numId w:val="1002"/>
+          <w:numId w:val="1005"/>
         </w:numPr>
       </w:pPr>
       <w:r>
@@ -1308,7 +2436,7 @@
         <w:pStyle w:val="Compact"/>
         <w:numPr>
           <w:ilvl w:val="0"/>
-          <w:numId w:val="1002"/>
+          <w:numId w:val="1005"/>
         </w:numPr>
       </w:pPr>
       <w:r>
@@ -1330,7 +2458,7 @@
         <w:pStyle w:val="Compact"/>
         <w:numPr>
           <w:ilvl w:val="0"/>
-          <w:numId w:val="1002"/>
+          <w:numId w:val="1005"/>
         </w:numPr>
       </w:pPr>
       <w:r>
@@ -1352,7 +2480,7 @@
         <w:pStyle w:val="Compact"/>
         <w:numPr>
           <w:ilvl w:val="0"/>
-          <w:numId w:val="1002"/>
+          <w:numId w:val="1005"/>
         </w:numPr>
       </w:pPr>
       <w:r>
@@ -1369,9 +2497,9 @@
         <w:t xml:space="preserve">se eligió Mermaid por rapidez de iteración e integración con el repositorio; si se necesitara la notación estricta de casos de uso, se complementa con esas herramientas.</w:t>
       </w:r>
     </w:p>
-    <w:bookmarkEnd w:id="60"/>
-    <w:bookmarkEnd w:id="61"/>
-    <w:bookmarkStart w:id="62" w:name="objetivos-del-sistema"/>
+    <w:bookmarkEnd w:id="75"/>
+    <w:bookmarkEnd w:id="76"/>
+    <w:bookmarkStart w:id="77" w:name="objetivos-del-sistema"/>
     <w:p>
       <w:pPr>
         <w:pStyle w:val="Heading1"/>
@@ -1393,7 +2521,7 @@
         <w:pStyle w:val="Compact"/>
         <w:numPr>
           <w:ilvl w:val="0"/>
-          <w:numId w:val="1003"/>
+          <w:numId w:val="1006"/>
         </w:numPr>
       </w:pPr>
       <w:r>
@@ -1415,7 +2543,7 @@
         <w:pStyle w:val="Compact"/>
         <w:numPr>
           <w:ilvl w:val="0"/>
-          <w:numId w:val="1003"/>
+          <w:numId w:val="1006"/>
         </w:numPr>
       </w:pPr>
       <w:r>
@@ -1437,7 +2565,7 @@
         <w:pStyle w:val="Compact"/>
         <w:numPr>
           <w:ilvl w:val="0"/>
-          <w:numId w:val="1003"/>
+          <w:numId w:val="1006"/>
         </w:numPr>
       </w:pPr>
       <w:r>
@@ -1459,7 +2587,7 @@
         <w:pStyle w:val="Compact"/>
         <w:numPr>
           <w:ilvl w:val="0"/>
-          <w:numId w:val="1003"/>
+          <w:numId w:val="1006"/>
         </w:numPr>
       </w:pPr>
       <w:r>
@@ -1494,7 +2622,7 @@
         <w:pStyle w:val="Compact"/>
         <w:numPr>
           <w:ilvl w:val="0"/>
-          <w:numId w:val="1003"/>
+          <w:numId w:val="1006"/>
         </w:numPr>
       </w:pPr>
       <w:r>
@@ -1516,7 +2644,7 @@
         <w:pStyle w:val="Compact"/>
         <w:numPr>
           <w:ilvl w:val="0"/>
-          <w:numId w:val="1003"/>
+          <w:numId w:val="1006"/>
         </w:numPr>
       </w:pPr>
       <w:r>
@@ -1533,8 +2661,8 @@
         <w:t xml:space="preserve">— dashboard, estadísticas y reportes mensuales → MOD-Dashboard.</w:t>
       </w:r>
     </w:p>
-    <w:bookmarkEnd w:id="62"/>
-    <w:bookmarkStart w:id="67" w:name="alcance-y-fuera-de-alcance"/>
+    <w:bookmarkEnd w:id="77"/>
+    <w:bookmarkStart w:id="82" w:name="alcance-y-fuera-de-alcance"/>
     <w:p>
       <w:pPr>
         <w:pStyle w:val="Heading1"/>
@@ -1543,7 +2671,7 @@
         <w:t xml:space="preserve">Alcance y fuera de alcance</w:t>
       </w:r>
     </w:p>
-    <w:bookmarkStart w:id="63" w:name="módulos-incluidos-web-y-mobile"/>
+    <w:bookmarkStart w:id="78" w:name="módulos-incluidos-web-y-mobile"/>
     <w:p>
       <w:pPr>
         <w:pStyle w:val="Heading2"/>
@@ -1557,7 +2685,7 @@
         <w:pStyle w:val="Compact"/>
         <w:numPr>
           <w:ilvl w:val="0"/>
-          <w:numId w:val="1004"/>
+          <w:numId w:val="1007"/>
         </w:numPr>
       </w:pPr>
       <w:r>
@@ -1579,7 +2707,7 @@
         <w:pStyle w:val="Compact"/>
         <w:numPr>
           <w:ilvl w:val="0"/>
-          <w:numId w:val="1004"/>
+          <w:numId w:val="1007"/>
         </w:numPr>
       </w:pPr>
       <w:r>
@@ -1601,7 +2729,7 @@
         <w:pStyle w:val="Compact"/>
         <w:numPr>
           <w:ilvl w:val="0"/>
-          <w:numId w:val="1004"/>
+          <w:numId w:val="1007"/>
         </w:numPr>
       </w:pPr>
       <w:r>
@@ -1623,7 +2751,7 @@
         <w:pStyle w:val="Compact"/>
         <w:numPr>
           <w:ilvl w:val="0"/>
-          <w:numId w:val="1004"/>
+          <w:numId w:val="1007"/>
         </w:numPr>
       </w:pPr>
       <w:r>
@@ -1645,7 +2773,7 @@
         <w:pStyle w:val="Compact"/>
         <w:numPr>
           <w:ilvl w:val="0"/>
-          <w:numId w:val="1004"/>
+          <w:numId w:val="1007"/>
         </w:numPr>
       </w:pPr>
       <w:r>
@@ -1667,7 +2795,7 @@
         <w:pStyle w:val="Compact"/>
         <w:numPr>
           <w:ilvl w:val="0"/>
-          <w:numId w:val="1004"/>
+          <w:numId w:val="1007"/>
         </w:numPr>
       </w:pPr>
       <w:r>
@@ -1689,7 +2817,7 @@
         <w:pStyle w:val="Compact"/>
         <w:numPr>
           <w:ilvl w:val="0"/>
-          <w:numId w:val="1004"/>
+          <w:numId w:val="1007"/>
         </w:numPr>
       </w:pPr>
       <w:r>
@@ -1711,7 +2839,7 @@
         <w:pStyle w:val="Compact"/>
         <w:numPr>
           <w:ilvl w:val="0"/>
-          <w:numId w:val="1004"/>
+          <w:numId w:val="1007"/>
         </w:numPr>
       </w:pPr>
       <w:r>
@@ -1733,7 +2861,7 @@
         <w:pStyle w:val="Compact"/>
         <w:numPr>
           <w:ilvl w:val="0"/>
-          <w:numId w:val="1004"/>
+          <w:numId w:val="1007"/>
         </w:numPr>
       </w:pPr>
       <w:r>
@@ -1755,7 +2883,7 @@
         <w:pStyle w:val="Compact"/>
         <w:numPr>
           <w:ilvl w:val="0"/>
-          <w:numId w:val="1004"/>
+          <w:numId w:val="1007"/>
         </w:numPr>
       </w:pPr>
       <w:r>
@@ -1777,7 +2905,7 @@
         <w:pStyle w:val="Compact"/>
         <w:numPr>
           <w:ilvl w:val="0"/>
-          <w:numId w:val="1004"/>
+          <w:numId w:val="1007"/>
         </w:numPr>
       </w:pPr>
       <w:r>
@@ -1794,8 +2922,8 @@
         <w:t xml:space="preserve">— acceso individual con usuario y contraseña, roles con distinta visibilidad y registro de autoría de los cambios.</w:t>
       </w:r>
     </w:p>
-    <w:bookmarkEnd w:id="63"/>
-    <w:bookmarkStart w:id="64" w:name="fuera-de-alcance-esta-etapa"/>
+    <w:bookmarkEnd w:id="78"/>
+    <w:bookmarkStart w:id="79" w:name="fuera-de-alcance-esta-etapa"/>
     <w:p>
       <w:pPr>
         <w:pStyle w:val="Heading2"/>
@@ -1809,7 +2937,7 @@
         <w:pStyle w:val="Compact"/>
         <w:numPr>
           <w:ilvl w:val="0"/>
-          <w:numId w:val="1005"/>
+          <w:numId w:val="1008"/>
         </w:numPr>
       </w:pPr>
       <w:r>
@@ -1831,7 +2959,7 @@
         <w:pStyle w:val="Compact"/>
         <w:numPr>
           <w:ilvl w:val="0"/>
-          <w:numId w:val="1005"/>
+          <w:numId w:val="1008"/>
         </w:numPr>
       </w:pPr>
       <w:r>
@@ -1853,7 +2981,7 @@
         <w:pStyle w:val="Compact"/>
         <w:numPr>
           <w:ilvl w:val="0"/>
-          <w:numId w:val="1005"/>
+          <w:numId w:val="1008"/>
         </w:numPr>
       </w:pPr>
       <w:r>
@@ -1875,7 +3003,7 @@
         <w:pStyle w:val="Compact"/>
         <w:numPr>
           <w:ilvl w:val="0"/>
-          <w:numId w:val="1005"/>
+          <w:numId w:val="1008"/>
         </w:numPr>
       </w:pPr>
       <w:r>
@@ -1891,7 +3019,7 @@
         <w:pStyle w:val="Compact"/>
         <w:numPr>
           <w:ilvl w:val="0"/>
-          <w:numId w:val="1005"/>
+          <w:numId w:val="1008"/>
         </w:numPr>
       </w:pPr>
       <w:r>
@@ -1942,7 +3070,7 @@
         <w:pStyle w:val="Compact"/>
         <w:numPr>
           <w:ilvl w:val="0"/>
-          <w:numId w:val="1005"/>
+          <w:numId w:val="1008"/>
         </w:numPr>
       </w:pPr>
       <w:r>
@@ -1959,8 +3087,8 @@
         <w:t xml:space="preserve">el sistema genera el aviso internamente y la persona decide cuándo escribirle por el canal que corresponda. La automatización por WhatsApp queda para más adelante y será configurable.</w:t>
       </w:r>
     </w:p>
-    <w:bookmarkEnd w:id="64"/>
-    <w:bookmarkStart w:id="65" w:name="incluido-explícitamente"/>
+    <w:bookmarkEnd w:id="79"/>
+    <w:bookmarkStart w:id="80" w:name="incluido-explícitamente"/>
     <w:p>
       <w:pPr>
         <w:pStyle w:val="Heading2"/>
@@ -1974,7 +3102,7 @@
         <w:pStyle w:val="Compact"/>
         <w:numPr>
           <w:ilvl w:val="0"/>
-          <w:numId w:val="1006"/>
+          <w:numId w:val="1009"/>
         </w:numPr>
       </w:pPr>
       <w:r>
@@ -2025,7 +3153,7 @@
         <w:pStyle w:val="Compact"/>
         <w:numPr>
           <w:ilvl w:val="0"/>
-          <w:numId w:val="1006"/>
+          <w:numId w:val="1009"/>
         </w:numPr>
       </w:pPr>
       <w:r>
@@ -2042,8 +3170,8 @@
         <w:t xml:space="preserve">cada Hotel del itinerario puede tener su fecha de vencimiento de pago a proveedor, con Alerta un mes antes (CU-09 Armar itinerario de hoteles).</w:t>
       </w:r>
     </w:p>
-    <w:bookmarkEnd w:id="65"/>
-    <w:bookmarkStart w:id="66" w:name="fase-2-fuera-de-esta-etapa"/>
+    <w:bookmarkEnd w:id="80"/>
+    <w:bookmarkStart w:id="81" w:name="fase-2-fuera-de-esta-etapa"/>
     <w:p>
       <w:pPr>
         <w:pStyle w:val="Heading2"/>
@@ -2057,7 +3185,7 @@
         <w:pStyle w:val="Compact"/>
         <w:numPr>
           <w:ilvl w:val="0"/>
-          <w:numId w:val="1007"/>
+          <w:numId w:val="1010"/>
         </w:numPr>
       </w:pPr>
       <w:r>
@@ -2079,7 +3207,7 @@
         <w:pStyle w:val="Compact"/>
         <w:numPr>
           <w:ilvl w:val="0"/>
-          <w:numId w:val="1007"/>
+          <w:numId w:val="1010"/>
         </w:numPr>
       </w:pPr>
       <w:r>
@@ -2101,7 +3229,7 @@
         <w:pStyle w:val="Compact"/>
         <w:numPr>
           <w:ilvl w:val="0"/>
-          <w:numId w:val="1007"/>
+          <w:numId w:val="1010"/>
         </w:numPr>
       </w:pPr>
       <w:r>
@@ -2118,9 +3246,9 @@
         <w:t xml:space="preserve">publicación directa en redes y conexión con proveedores.</w:t>
       </w:r>
     </w:p>
-    <w:bookmarkEnd w:id="66"/>
-    <w:bookmarkEnd w:id="67"/>
-    <w:bookmarkStart w:id="74" w:name="actores"/>
+    <w:bookmarkEnd w:id="81"/>
+    <w:bookmarkEnd w:id="82"/>
+    <w:bookmarkStart w:id="89" w:name="actores"/>
     <w:p>
       <w:pPr>
         <w:pStyle w:val="Heading1"/>
@@ -2137,7 +3265,7 @@
         <w:t xml:space="preserve">En una PyME una misma persona puede cubrir varios roles.</w:t>
       </w:r>
     </w:p>
-    <w:bookmarkStart w:id="68" w:name="empleado-asesor-usuario-principal"/>
+    <w:bookmarkStart w:id="83" w:name="empleado-asesor-usuario-principal"/>
     <w:p>
       <w:pPr>
         <w:pStyle w:val="Heading2"/>
@@ -2214,8 +3342,8 @@
         <w:t xml:space="preserve">Casos de uso: CU-01 De la consulta a la venta.</w:t>
       </w:r>
     </w:p>
-    <w:bookmarkEnd w:id="68"/>
-    <w:bookmarkStart w:id="69" w:name="administrador-configuración-y-operación"/>
+    <w:bookmarkEnd w:id="83"/>
+    <w:bookmarkStart w:id="84" w:name="administrador-configuración-y-operación"/>
     <w:p>
       <w:pPr>
         <w:pStyle w:val="Heading2"/>
@@ -2283,8 +3411,8 @@
         <w:t xml:space="preserve">.</w:t>
       </w:r>
     </w:p>
-    <w:bookmarkEnd w:id="69"/>
-    <w:bookmarkStart w:id="70" w:name="dueñoa-visión-del-negocio"/>
+    <w:bookmarkEnd w:id="84"/>
+    <w:bookmarkStart w:id="85" w:name="dueñoa-visión-del-negocio"/>
     <w:p>
       <w:pPr>
         <w:pStyle w:val="Heading2"/>
@@ -2339,8 +3467,8 @@
         <w:t xml:space="preserve">.</w:t>
       </w:r>
     </w:p>
-    <w:bookmarkEnd w:id="70"/>
-    <w:bookmarkStart w:id="71" w:name="X6c0ef285ed268354d46c074c14239c2805ce85b"/>
+    <w:bookmarkEnd w:id="85"/>
+    <w:bookmarkStart w:id="86" w:name="X6c0ef285ed268354d46c074c14239c2805ce85b"/>
     <w:p>
       <w:pPr>
         <w:pStyle w:val="Heading2"/>
@@ -2423,8 +3551,8 @@
         <w:t xml:space="preserve">.</w:t>
       </w:r>
     </w:p>
-    <w:bookmarkEnd w:id="71"/>
-    <w:bookmarkStart w:id="72" w:name="X8f5e30d3a5e8695bc0eada9c82b6705f97940fc"/>
+    <w:bookmarkEnd w:id="86"/>
+    <w:bookmarkStart w:id="87" w:name="X8f5e30d3a5e8695bc0eada9c82b6705f97940fc"/>
     <w:p>
       <w:pPr>
         <w:pStyle w:val="Heading2"/>
@@ -2512,8 +3640,8 @@
         <w:t xml:space="preserve">(o cubren ellos mismos). En una PyME suele concentrarse en una persona.</w:t>
       </w:r>
     </w:p>
-    <w:bookmarkEnd w:id="72"/>
-    <w:bookmarkStart w:id="73" w:name="pasajero-cliente-actor-externo"/>
+    <w:bookmarkEnd w:id="87"/>
+    <w:bookmarkStart w:id="88" w:name="pasajero-cliente-actor-externo"/>
     <w:p>
       <w:pPr>
         <w:pStyle w:val="Heading2"/>
@@ -2556,9 +3684,9 @@
         <w:t xml:space="preserve">Se modela como Cliente (dato), no como Usuario (operador).</w:t>
       </w:r>
     </w:p>
-    <w:bookmarkEnd w:id="73"/>
-    <w:bookmarkEnd w:id="74"/>
-    <w:bookmarkStart w:id="81" w:name="circuito-de-la-consulta-a-la-venta"/>
+    <w:bookmarkEnd w:id="88"/>
+    <w:bookmarkEnd w:id="89"/>
+    <w:bookmarkStart w:id="96" w:name="circuito-de-la-consulta-a-la-venta"/>
     <w:p>
       <w:pPr>
         <w:pStyle w:val="Heading1"/>
@@ -2609,7 +3737,7 @@
         <w:t xml:space="preserve">llega una consulta por Instagram, WhatsApp o de forma presencial.</w:t>
       </w:r>
     </w:p>
-    <w:bookmarkStart w:id="75" w:name="los-seis-pasos-del-circuito"/>
+    <w:bookmarkStart w:id="90" w:name="los-seis-pasos-del-circuito"/>
     <w:p>
       <w:pPr>
         <w:pStyle w:val="Heading2"/>
@@ -2623,7 +3751,7 @@
         <w:pStyle w:val="Compact"/>
         <w:numPr>
           <w:ilvl w:val="0"/>
-          <w:numId w:val="1008"/>
+          <w:numId w:val="1011"/>
         </w:numPr>
       </w:pPr>
       <w:r>
@@ -2645,7 +3773,7 @@
         <w:pStyle w:val="Compact"/>
         <w:numPr>
           <w:ilvl w:val="0"/>
-          <w:numId w:val="1008"/>
+          <w:numId w:val="1011"/>
         </w:numPr>
       </w:pPr>
       <w:r>
@@ -2667,7 +3795,7 @@
         <w:pStyle w:val="Compact"/>
         <w:numPr>
           <w:ilvl w:val="0"/>
-          <w:numId w:val="1008"/>
+          <w:numId w:val="1011"/>
         </w:numPr>
       </w:pPr>
       <w:r>
@@ -2689,7 +3817,7 @@
         <w:pStyle w:val="Compact"/>
         <w:numPr>
           <w:ilvl w:val="0"/>
-          <w:numId w:val="1008"/>
+          <w:numId w:val="1011"/>
         </w:numPr>
       </w:pPr>
       <w:r>
@@ -2711,7 +3839,7 @@
         <w:pStyle w:val="Compact"/>
         <w:numPr>
           <w:ilvl w:val="0"/>
-          <w:numId w:val="1008"/>
+          <w:numId w:val="1011"/>
         </w:numPr>
       </w:pPr>
       <w:r>
@@ -2733,7 +3861,7 @@
         <w:pStyle w:val="Compact"/>
         <w:numPr>
           <w:ilvl w:val="0"/>
-          <w:numId w:val="1008"/>
+          <w:numId w:val="1011"/>
         </w:numPr>
       </w:pPr>
       <w:r>
@@ -2750,8 +3878,8 @@
         <w:t xml:space="preserve">Al finalizar el viaje, el sistema recuerda pedir la reseña; el cliente la deja y el hotel queda consolidado en el catálogo para futuras recomendaciones.</w:t>
       </w:r>
     </w:p>
-    <w:bookmarkEnd w:id="75"/>
-    <w:bookmarkStart w:id="76" w:name="situaciones-frecuentes"/>
+    <w:bookmarkEnd w:id="90"/>
+    <w:bookmarkStart w:id="91" w:name="situaciones-frecuentes"/>
     <w:p>
       <w:pPr>
         <w:pStyle w:val="Heading2"/>
@@ -2765,7 +3893,7 @@
         <w:pStyle w:val="Compact"/>
         <w:numPr>
           <w:ilvl w:val="0"/>
-          <w:numId w:val="1009"/>
+          <w:numId w:val="1012"/>
         </w:numPr>
       </w:pPr>
       <w:r>
@@ -2787,7 +3915,7 @@
         <w:pStyle w:val="Compact"/>
         <w:numPr>
           <w:ilvl w:val="0"/>
-          <w:numId w:val="1009"/>
+          <w:numId w:val="1012"/>
         </w:numPr>
       </w:pPr>
       <w:r>
@@ -2809,7 +3937,7 @@
         <w:pStyle w:val="Compact"/>
         <w:numPr>
           <w:ilvl w:val="0"/>
-          <w:numId w:val="1009"/>
+          <w:numId w:val="1012"/>
         </w:numPr>
       </w:pPr>
       <w:r>
@@ -2831,7 +3959,7 @@
         <w:pStyle w:val="Compact"/>
         <w:numPr>
           <w:ilvl w:val="0"/>
-          <w:numId w:val="1009"/>
+          <w:numId w:val="1012"/>
         </w:numPr>
       </w:pPr>
       <w:r>
@@ -2848,8 +3976,8 @@
         <w:t xml:space="preserve">la oportunidad se cierra como perdida registrando el motivo, que después alimenta los reportes.</w:t>
       </w:r>
     </w:p>
-    <w:bookmarkEnd w:id="76"/>
-    <w:bookmarkStart w:id="80" w:name="resultado"/>
+    <w:bookmarkEnd w:id="91"/>
+    <w:bookmarkStart w:id="95" w:name="resultado"/>
     <w:p>
       <w:pPr>
         <w:pStyle w:val="Heading2"/>
@@ -2875,18 +4003,18 @@
           <wp:inline>
             <wp:extent cx="5465445" cy="7194310"/>
             <wp:effectExtent b="0" l="0" r="0" t="0"/>
-            <wp:docPr descr="Figura 1. Diagrama de secuencia del circuito de la consulta a la venta." title="" id="78" name="Picture"/>
+            <wp:docPr descr="Figura 1. Diagrama de secuencia del circuito de la consulta a la venta." title="" id="93" name="Picture"/>
             <a:graphic>
               <a:graphicData uri="http://schemas.openxmlformats.org/drawingml/2006/picture">
                 <pic:pic>
                   <pic:nvPicPr>
-                    <pic:cNvPr descr="DGM-SEC-consulta-a-venta.png" id="79" name="Picture"/>
+                    <pic:cNvPr descr="DGM-SEC-consulta-a-venta.png" id="94" name="Picture"/>
                     <pic:cNvPicPr>
                       <a:picLocks noChangeArrowheads="1" noChangeAspect="1"/>
                     </pic:cNvPicPr>
                   </pic:nvPicPr>
                   <pic:blipFill>
-                    <a:blip r:embed="rId77"/>
+                    <a:blip r:embed="rId92"/>
                     <a:stretch>
                       <a:fillRect/>
                     </a:stretch>
@@ -2921,8 +4049,8 @@
         <w:t xml:space="preserve">Figura 1. Diagrama de secuencia del circuito de la consulta a la venta.</w:t>
       </w:r>
     </w:p>
-    <w:bookmarkEnd w:id="80"/>
-    <w:bookmarkEnd w:id="81"/>
+    <w:bookmarkEnd w:id="95"/>
+    <w:bookmarkEnd w:id="96"/>
     <w:sectPr>
       <w:footerReference r:id="rId40" w:type="default"/>
       <w:footnotePr>
@@ -3289,6 +4417,15 @@
     <w:abstractNumId w:val="991"/>
   </w:num>
   <w:num w:numId="1003">
+    <w:abstractNumId w:val="991"/>
+  </w:num>
+  <w:num w:numId="1004">
+    <w:abstractNumId w:val="991"/>
+  </w:num>
+  <w:num w:numId="1005">
+    <w:abstractNumId w:val="991"/>
+  </w:num>
+  <w:num w:numId="1006">
     <w:abstractNumId w:val="99411"/>
     <w:lvlOverride w:ilvl="0">
       <w:startOverride w:val="1"/>
@@ -3318,19 +4455,19 @@
       <w:startOverride w:val="1"/>
     </w:lvlOverride>
   </w:num>
-  <w:num w:numId="1004">
-    <w:abstractNumId w:val="991"/>
-  </w:num>
-  <w:num w:numId="1005">
-    <w:abstractNumId w:val="991"/>
-  </w:num>
-  <w:num w:numId="1006">
-    <w:abstractNumId w:val="991"/>
-  </w:num>
   <w:num w:numId="1007">
     <w:abstractNumId w:val="991"/>
   </w:num>
   <w:num w:numId="1008">
+    <w:abstractNumId w:val="991"/>
+  </w:num>
+  <w:num w:numId="1009">
+    <w:abstractNumId w:val="991"/>
+  </w:num>
+  <w:num w:numId="1010">
+    <w:abstractNumId w:val="991"/>
+  </w:num>
+  <w:num w:numId="1011">
     <w:abstractNumId w:val="99411"/>
     <w:lvlOverride w:ilvl="0">
       <w:startOverride w:val="1"/>
@@ -3360,7 +4497,7 @@
       <w:startOverride w:val="1"/>
     </w:lvlOverride>
   </w:num>
-  <w:num w:numId="1009">
+  <w:num w:numId="1012">
     <w:abstractNumId w:val="991"/>
   </w:num>
 </w:numbering>

</xml_diff>